<commit_message>
Added Tourist Beacon POC with scheduled tourist spawning, beacon pathing, arrival payment, and client/server wiring
</commit_message>
<xml_diff>
--- a/docs/Touristry Gameplay Design Notes.docx
+++ b/docs/Touristry Gameplay Design Notes.docx
@@ -787,6 +787,28 @@
     <w:p>
       <w:pPr>
         <w:numPr>
+          <w:ilvl w:val="1"/>
+          <w:numId w:val="1"/>
+        </w:numPr>
+      </w:pPr>
+      <w:r>
+        <w:t>Tab positions where experience templates can be placed.</w:t>
+      </w:r>
+    </w:p>
+    <w:p>
+      <w:pPr>
+        <w:numPr>
+          <w:ilvl w:val="0"/>
+          <w:numId w:val="1"/>
+        </w:numPr>
+      </w:pPr>
+      <w:r>
+        <w:t>Tourist beacons support two experiences by default. They can be upgraded to support more.</w:t>
+      </w:r>
+    </w:p>
+    <w:p>
+      <w:pPr>
+        <w:numPr>
           <w:ilvl w:val="0"/>
           <w:numId w:val="1"/>
         </w:numPr>
@@ -993,6 +1015,7 @@
         </w:numPr>
       </w:pPr>
       <w:r>
+        <w:lastRenderedPageBreak/>
         <w:t xml:space="preserve">In general, any owner can set the current prices for experiences defined in </w:t>
       </w:r>
       <w:r>
@@ -1021,7 +1044,6 @@
         </w:numPr>
       </w:pPr>
       <w:r>
-        <w:lastRenderedPageBreak/>
         <w:t>A value in emeralds, diamonds, lapis lazuli, gold ingots, iron ingots, or copper ingots</w:t>
       </w:r>
     </w:p>
@@ -1223,6 +1245,7 @@
         </w:numPr>
       </w:pPr>
       <w:r>
+        <w:lastRenderedPageBreak/>
         <w:t>Current balance</w:t>
       </w:r>
     </w:p>
@@ -1256,7 +1279,6 @@
         </w:numPr>
       </w:pPr>
       <w:r>
-        <w:lastRenderedPageBreak/>
         <w:t xml:space="preserve">When </w:t>
       </w:r>
       <w:r>
@@ -1661,6 +1683,7 @@
           </w:tcPr>
           <w:p>
             <w:r>
+              <w:lastRenderedPageBreak/>
               <w:t>Coal,</w:t>
             </w:r>
           </w:p>
@@ -1714,7 +1737,6 @@
         </w:numPr>
       </w:pPr>
       <w:r>
-        <w:lastRenderedPageBreak/>
         <w:t xml:space="preserve">At every experience, there's a chance that the Tourist group will come together and one will hold up a </w:t>
       </w:r>
       <w:r>
@@ -1927,6 +1949,7 @@
         </w:numPr>
       </w:pPr>
       <w:r>
+        <w:lastRenderedPageBreak/>
         <w:t>Future version ideas:</w:t>
       </w:r>
     </w:p>
@@ -1958,7 +1981,6 @@
           <w:b/>
           <w:bCs/>
         </w:rPr>
-        <w:lastRenderedPageBreak/>
         <w:t>Sightseeing experience</w:t>
       </w:r>
     </w:p>
@@ -2144,6 +2166,7 @@
         </w:numPr>
       </w:pPr>
       <w:r>
+        <w:lastRenderedPageBreak/>
         <w:t xml:space="preserve">If a Tourist group has paid but can't find all the beds before midnight, they will leave and the </w:t>
       </w:r>
       <w:r>
@@ -2172,7 +2195,6 @@
         </w:numPr>
       </w:pPr>
       <w:r>
-        <w:lastRenderedPageBreak/>
         <w:t>If blocks are destroyed within an experience area between midnight and dawn, your area will lose reputation for noise.</w:t>
       </w:r>
     </w:p>
@@ -4086,7 +4108,6 @@
   <w:style w:type="character" w:default="1" w:styleId="DefaultParagraphFont">
     <w:name w:val="Default Paragraph Font"/>
     <w:uiPriority w:val="1"/>
-    <w:semiHidden/>
     <w:unhideWhenUsed/>
   </w:style>
   <w:style w:type="table" w:default="1" w:styleId="TableNormal">

</xml_diff>

<commit_message>
Updated gameplay design notes
</commit_message>
<xml_diff>
--- a/docs/Touristry Gameplay Design Notes.docx
+++ b/docs/Touristry Gameplay Design Notes.docx
@@ -28,12 +28,6 @@
       </w:r>
     </w:p>
     <w:p>
-      <w:pPr>
-        <w:numPr>
-          <w:ilvl w:val="0"/>
-          <w:numId w:val="1"/>
-        </w:numPr>
-      </w:pPr>
       <w:r>
         <w:t xml:space="preserve">A new entity, the </w:t>
       </w:r>
@@ -62,162 +56,231 @@
           <w:b/>
           <w:bCs/>
         </w:rPr>
-        <w:t xml:space="preserve">Tourist </w:t>
+        <w:t xml:space="preserve">Tourist Beacon </w:t>
+      </w:r>
+      <w:r>
+        <w:t>block is placed and opened for business.</w:t>
+      </w:r>
+    </w:p>
+    <w:p>
+      <w:r>
+        <w:t xml:space="preserve">Each morning, the </w:t>
       </w:r>
       <w:r>
         <w:rPr>
           <w:b/>
           <w:bCs/>
         </w:rPr>
-        <w:t>B</w:t>
+        <w:t>Tourism Manager</w:t>
+      </w:r>
+      <w:r>
+        <w:t xml:space="preserve"> controller will determine how many </w:t>
       </w:r>
       <w:r>
         <w:rPr>
           <w:b/>
           <w:bCs/>
         </w:rPr>
-        <w:t xml:space="preserve">eacon </w:t>
-      </w:r>
-      <w:r>
-        <w:t xml:space="preserve">block with one or more </w:t>
+        <w:t xml:space="preserve">Tourists </w:t>
+      </w:r>
+      <w:r>
+        <w:t>to try to spawn to visit each tourist beacon.</w:t>
+      </w:r>
+    </w:p>
+    <w:p>
+      <w:r>
+        <w:t xml:space="preserve">Some Tourists will be drawn to specific </w:t>
+      </w:r>
+      <w:r>
+        <w:rPr>
+          <w:i/>
+          <w:iCs/>
+        </w:rPr>
+        <w:t>experiences</w:t>
+      </w:r>
+      <w:r>
+        <w:t xml:space="preserve"> in the world, based on the reputation of the tourist beacon, and what time of day they will arrive.</w:t>
+      </w:r>
+    </w:p>
+    <w:p>
+      <w:r>
+        <w:t>Sometimes, tourists will spawn in groups.</w:t>
+      </w:r>
+    </w:p>
+    <w:p>
+      <w:r>
+        <w:t>A Tourist group will consist of between 1 and 4 Tourists. A group will consist of at least 1 adult. The remaining number will be either adults or children. The group will always travel together.</w:t>
+      </w:r>
+    </w:p>
+    <w:p>
+      <w:r>
+        <w:t>The earliest a tourist or tourist group will arrive is 8:00 AM (2 hours after players and villagers awaken).</w:t>
+      </w:r>
+    </w:p>
+    <w:p>
+      <w:r>
+        <w:t xml:space="preserve">The latest they will arrive is 3:00 PM (3 hours before </w:t>
+      </w:r>
+      <w:proofErr w:type="gramStart"/>
+      <w:r>
+        <w:t>villagers</w:t>
+      </w:r>
+      <w:proofErr w:type="gramEnd"/>
+      <w:r>
+        <w:t xml:space="preserve"> sleep).</w:t>
+      </w:r>
+    </w:p>
+    <w:p>
+      <w:r>
+        <w:t>Each Tourist has a full name.</w:t>
+      </w:r>
+    </w:p>
+    <w:p>
+      <w:r>
+        <w:t>Groups might or might not have the same last name.</w:t>
+      </w:r>
+    </w:p>
+    <w:p>
+      <w:r>
+        <w:t>Each Tourist has a random speed.</w:t>
+      </w:r>
+    </w:p>
+    <w:p>
+      <w:r>
+        <w:t>Groups travel at the slowest speed in the group.</w:t>
+      </w:r>
+    </w:p>
+    <w:p>
+      <w:r>
+        <w:t>Players cannot trade directly with Tourists (at first).</w:t>
+      </w:r>
+    </w:p>
+    <w:p>
+      <w:r>
+        <w:t>Tourists are NPCs who are drawn to these tourist beacons, and travel long ways using teleportation to visit and spend their emeralds or other forms of currency.</w:t>
+      </w:r>
+    </w:p>
+    <w:p>
+      <w:r>
+        <w:t xml:space="preserve">When Tourists disappear using teleportation, purple </w:t>
+      </w:r>
+      <w:proofErr w:type="spellStart"/>
+      <w:r>
+        <w:t>Enderman</w:t>
+      </w:r>
+      <w:proofErr w:type="spellEnd"/>
+      <w:r>
+        <w:t xml:space="preserve"> particles appear where they were, and the </w:t>
+      </w:r>
+      <w:proofErr w:type="spellStart"/>
+      <w:r>
+        <w:t>Enderman</w:t>
+      </w:r>
+      <w:proofErr w:type="spellEnd"/>
+      <w:r>
+        <w:t xml:space="preserve"> teleportation sound plays.</w:t>
+      </w:r>
+    </w:p>
+    <w:p>
+      <w:r>
+        <w:t xml:space="preserve">Tourists will try to spawn between 35 and 70 blocks </w:t>
+      </w:r>
+      <w:proofErr w:type="gramStart"/>
+      <w:r>
+        <w:t>away,</w:t>
+      </w:r>
+      <w:proofErr w:type="gramEnd"/>
+      <w:r>
+        <w:t xml:space="preserve"> from a random direction that's on dry land. They'll make up to 8 attempts to find a safe spawn point. If they can't find any, they'll give up, and that experience will lose a small amount of reputation.</w:t>
+      </w:r>
+    </w:p>
+    <w:p>
+      <w:r>
+        <w:t xml:space="preserve">Once spawned, they'll </w:t>
+      </w:r>
+      <w:proofErr w:type="spellStart"/>
+      <w:r>
+        <w:t>pathfind</w:t>
+      </w:r>
+      <w:proofErr w:type="spellEnd"/>
+      <w:r>
+        <w:t xml:space="preserve"> their way towards the tourist beacon.</w:t>
+      </w:r>
+    </w:p>
+    <w:p>
+      <w:r>
+        <w:lastRenderedPageBreak/>
+        <w:t>If they get stuck, they'll make up to 3 attempts to teleport to a different spawn point.</w:t>
+      </w:r>
+    </w:p>
+    <w:p>
+      <w:r>
+        <w:t>If they fail 3 times, or they don't make it by sunset, they'll give up and disappear, and that experience will lose a small amount of reputation.</w:t>
+      </w:r>
+    </w:p>
+    <w:p>
+      <w:r>
+        <w:t>If a Tourist gets hurt on their way to the experience, the beacon will lose reputation.</w:t>
+      </w:r>
+    </w:p>
+    <w:p>
+      <w:r>
+        <w:t>If part of a group, they and the group will likely disappear.</w:t>
+      </w:r>
+    </w:p>
+    <w:p>
+      <w:r>
+        <w:t>If a Tourist is killed, the beacon will lose even more reputation.</w:t>
+      </w:r>
+    </w:p>
+    <w:p>
+      <w:r>
+        <w:t>If part of a group, they will all, 100%, disappear.</w:t>
+      </w:r>
+    </w:p>
+    <w:p>
+      <w:r>
+        <w:t>When a Tourist arrives at a tourist beacon, they'll have a daily budget they're willing to spend, specified as a number of emeralds.</w:t>
+      </w:r>
+    </w:p>
+    <w:p>
+      <w:r>
+        <w:t>If part of a group, the budget will be calculated per Tourist.</w:t>
+      </w:r>
+    </w:p>
+    <w:p>
+      <w:r>
+        <w:t>Tourist groups will pool their money.</w:t>
+      </w:r>
+    </w:p>
+    <w:p>
+      <w:r>
+        <w:t>If the experience won't take emeralds, they will have a table of equivalencies they can use.</w:t>
+      </w:r>
+    </w:p>
+    <w:p>
+      <w:r>
+        <w:t>The budget per Tourist is calculated on a curve, with the majority willing to spend between the equivalent of 3 and 5 emeralds per day. However, the curve extends way out (very rarely!!) to 50 emeralds.</w:t>
+      </w:r>
+    </w:p>
+    <w:p>
+      <w:r>
+        <w:t xml:space="preserve">Tourists will pick up a </w:t>
       </w:r>
       <w:r>
         <w:rPr>
           <w:b/>
           <w:bCs/>
         </w:rPr>
-        <w:t>experiences</w:t>
-      </w:r>
-      <w:r>
-        <w:t xml:space="preserve"> is placed and opened for business.</w:t>
-      </w:r>
-    </w:p>
-    <w:p>
-      <w:pPr>
-        <w:numPr>
-          <w:ilvl w:val="0"/>
-          <w:numId w:val="1"/>
-        </w:numPr>
-      </w:pPr>
-      <w:r>
-        <w:t xml:space="preserve">Each morning, the world will determine how many </w:t>
-      </w:r>
-      <w:r>
-        <w:rPr>
-          <w:b/>
-          <w:bCs/>
-        </w:rPr>
-        <w:t>Tourist groups</w:t>
-      </w:r>
-      <w:r>
-        <w:t xml:space="preserve"> to try to spawn to visit each </w:t>
-      </w:r>
-      <w:r>
-        <w:rPr>
-          <w:i/>
-          <w:iCs/>
-        </w:rPr>
-        <w:t>experience</w:t>
-      </w:r>
-      <w:r>
-        <w:t xml:space="preserve"> in the world, based on the reputation of the </w:t>
-      </w:r>
-      <w:r>
-        <w:t>tourist beacon</w:t>
-      </w:r>
-      <w:r>
-        <w:t>, and what time of day they will arrive.</w:t>
-      </w:r>
-    </w:p>
-    <w:p>
-      <w:pPr>
-        <w:numPr>
-          <w:ilvl w:val="0"/>
-          <w:numId w:val="1"/>
-        </w:numPr>
-      </w:pPr>
-      <w:r>
-        <w:t>A Tourist group will consist of between 1 and 4 Tourists. A group will consist of at least 1 adult. The remaining number will be either adults or children. The group will always travel together.</w:t>
-      </w:r>
-    </w:p>
-    <w:p>
-      <w:pPr>
-        <w:numPr>
-          <w:ilvl w:val="0"/>
-          <w:numId w:val="1"/>
-        </w:numPr>
-      </w:pPr>
-      <w:r>
-        <w:t>Each Tourist has a name.</w:t>
-      </w:r>
-    </w:p>
-    <w:p>
-      <w:pPr>
-        <w:numPr>
-          <w:ilvl w:val="0"/>
-          <w:numId w:val="1"/>
-        </w:numPr>
-      </w:pPr>
-      <w:r>
-        <w:t>Players cannot trade directly with Tourists.</w:t>
-      </w:r>
-    </w:p>
-    <w:p>
-      <w:pPr>
-        <w:numPr>
-          <w:ilvl w:val="0"/>
-          <w:numId w:val="1"/>
-        </w:numPr>
-      </w:pPr>
-      <w:r>
-        <w:t xml:space="preserve">Tourists are NPCs who are drawn to these </w:t>
-      </w:r>
-      <w:r>
-        <w:t>tourist beacon</w:t>
-      </w:r>
-      <w:r>
-        <w:t>s, and travel long ways using teleportation to visit and spend their emeralds or other forms of currency.</w:t>
-      </w:r>
-    </w:p>
-    <w:p>
-      <w:pPr>
-        <w:numPr>
-          <w:ilvl w:val="0"/>
-          <w:numId w:val="1"/>
-        </w:numPr>
-      </w:pPr>
-      <w:r>
-        <w:t>When Tourists appear and disappear using teleportation, the effect looks like a double helix of purple portal particles surrounding them.</w:t>
-      </w:r>
-    </w:p>
-    <w:p>
-      <w:pPr>
-        <w:numPr>
-          <w:ilvl w:val="0"/>
-          <w:numId w:val="1"/>
-        </w:numPr>
-      </w:pPr>
-      <w:r>
-        <w:t xml:space="preserve">Tourists will try to spawn between 25 and 50 blocks </w:t>
-      </w:r>
-      <w:proofErr w:type="gramStart"/>
-      <w:r>
-        <w:t>away,</w:t>
-      </w:r>
-      <w:proofErr w:type="gramEnd"/>
-      <w:r>
-        <w:t xml:space="preserve"> from a random direction that's on dry land. If they can't find dry land 50 blocks away, they'll start searching closer and closer until they've found dry land, or until they're 1 block away. If they still can't find dry land 1 block away, they'll give up and disappear, and that experience will lose a small amount of reputation.</w:t>
-      </w:r>
-    </w:p>
-    <w:p>
-      <w:pPr>
-        <w:numPr>
-          <w:ilvl w:val="0"/>
-          <w:numId w:val="1"/>
-        </w:numPr>
-      </w:pPr>
-      <w:r>
-        <w:t xml:space="preserve">Once spawned, they'll </w:t>
+        <w:t>Tourist Map</w:t>
+      </w:r>
+      <w:r>
+        <w:t xml:space="preserve"> at a beacon, and then choose from all the experiences within range of the beacon, and eventually seek out other beacons.</w:t>
+      </w:r>
+    </w:p>
+    <w:p>
+      <w:r>
+        <w:t xml:space="preserve">A Tourist group will also arrive with a random amount of time they'll stay at a tourist beacon, wandering around or playing until that time is up, or the time becomes sunset, whichever comes first. When that time is up, if it's not sunset yet, there's a good chance they'll look for another experience within 50 blocks and </w:t>
       </w:r>
       <w:proofErr w:type="spellStart"/>
       <w:r>
@@ -225,133 +288,18 @@
       </w:r>
       <w:proofErr w:type="spellEnd"/>
       <w:r>
-        <w:t xml:space="preserve"> their way towards the </w:t>
-      </w:r>
-      <w:r>
-        <w:t>tourist beacon</w:t>
-      </w:r>
-      <w:r>
-        <w:t>. If they can't find a path, or they don't make it by sunset, they'll give up and disappear, and that experience will lose a small amount of reputation.</w:t>
-      </w:r>
-    </w:p>
-    <w:p>
-      <w:pPr>
-        <w:numPr>
-          <w:ilvl w:val="0"/>
-          <w:numId w:val="1"/>
-        </w:numPr>
-      </w:pPr>
-      <w:r>
-        <w:t xml:space="preserve">If any member of the group gets hurt on their way to the experience, the experience will lose reputation, and the group will likely disappear. If one or more of the </w:t>
-      </w:r>
-      <w:proofErr w:type="gramStart"/>
-      <w:r>
-        <w:t>group</w:t>
-      </w:r>
-      <w:proofErr w:type="gramEnd"/>
-      <w:r>
-        <w:t xml:space="preserve"> is killed, the experience will lose even more reputation and the group will 100% disappear.</w:t>
-      </w:r>
-    </w:p>
-    <w:p>
-      <w:pPr>
-        <w:numPr>
-          <w:ilvl w:val="0"/>
-          <w:numId w:val="1"/>
-        </w:numPr>
-      </w:pPr>
+        <w:t xml:space="preserve"> their way there. If at any time it becomes sunset, if they're at a dining experience, or at an experience where there is also a dining experience, and they can afford the dining experience, there's a chance they'll stay for dinner. At some random time between sunset and midnight, if they're at an experience where there's also a sleeping experience, there's a chance they'll stay overnight if they can afford it. If at any time during this process they determine they can't stay any longer, they'll leave (disappear). </w:t>
+      </w:r>
+    </w:p>
+    <w:p>
+      <w:r>
+        <w:t>In general, it pays to have multiple experiences in an area. The more experiences there are, the greater chance the Tourist group will decide to stay for dinner and/or sleeping over, and if they sleep over, there's a good chance they will stay in the area and continue going to nearby experiences, even while new Tourists show up.</w:t>
+      </w:r>
+    </w:p>
+    <w:p>
       <w:r>
         <w:lastRenderedPageBreak/>
-        <w:t xml:space="preserve">When a Tourist group arrives at </w:t>
-      </w:r>
-      <w:r>
-        <w:t>a tourist beacon</w:t>
-      </w:r>
-      <w:r>
-        <w:t>, they'll have a budget they're willing to spend, specified as a number of emeralds per Tourist. If the experience won't take emeralds, they will have a table of equivalencies they can use.</w:t>
-      </w:r>
-    </w:p>
-    <w:p>
-      <w:pPr>
-        <w:numPr>
-          <w:ilvl w:val="0"/>
-          <w:numId w:val="1"/>
-        </w:numPr>
-      </w:pPr>
-      <w:r>
-        <w:t>The budget is calculated per Tourist, but Tourist groups will pool their money.</w:t>
-      </w:r>
-    </w:p>
-    <w:p>
-      <w:pPr>
-        <w:numPr>
-          <w:ilvl w:val="0"/>
-          <w:numId w:val="1"/>
-        </w:numPr>
-      </w:pPr>
-      <w:r>
-        <w:t>The budget per Tourist is calculated on a curve, with the majority willing to spend between the equivalent of 3 and 5 emeralds per day. However, the curve extends out to 50 emeralds.</w:t>
-      </w:r>
-    </w:p>
-    <w:p>
-      <w:pPr>
-        <w:numPr>
-          <w:ilvl w:val="0"/>
-          <w:numId w:val="1"/>
-        </w:numPr>
-      </w:pPr>
-      <w:r>
-        <w:t xml:space="preserve">A Tourist group will also arrive with a random amount of time they'll stay at </w:t>
-      </w:r>
-      <w:r>
-        <w:t>a tourist beacon</w:t>
-      </w:r>
-      <w:r>
-        <w:t xml:space="preserve">, wandering around or playing until that time is up, or the time becomes sunset, whichever comes first. When that time is up, if it's not sunset yet, there's a good chance they'll look for another experience within 50 blocks and </w:t>
-      </w:r>
-      <w:proofErr w:type="spellStart"/>
-      <w:r>
-        <w:t>pathfind</w:t>
-      </w:r>
-      <w:proofErr w:type="spellEnd"/>
-      <w:r>
-        <w:t xml:space="preserve"> their way there. If at any time it becomes sunset, if they're at a dining experience, or at an experience where there is also a dining experience, and they can afford the dining experience, there's a chance they'll stay for dinner. At some random time between sunset and midnight, if they're at an experience where there's also a sleeping experience, there's a chance they'll stay overnight if they can afford it. If at any time during this process they determine they can't stay any longer, they'll leave (disappear). </w:t>
-      </w:r>
-    </w:p>
-    <w:p>
-      <w:pPr>
-        <w:numPr>
-          <w:ilvl w:val="0"/>
-          <w:numId w:val="1"/>
-        </w:numPr>
-      </w:pPr>
-      <w:r>
-        <w:t>In general, it pays to have multiple experiences in an area. The more experiences there are, the greater chance the Tourist group will decide to stay for dinner and/or sleeping over, and if they sleep over, there's a good chance they will stay in the area and continue going to nearby experiences, even while new Tourists show up.</w:t>
-      </w:r>
-    </w:p>
-    <w:p>
-      <w:pPr>
-        <w:numPr>
-          <w:ilvl w:val="0"/>
-          <w:numId w:val="1"/>
-        </w:numPr>
-      </w:pPr>
-      <w:r>
-        <w:t>Tourist budgets reset each new day.</w:t>
-      </w:r>
-    </w:p>
-    <w:p>
-      <w:pPr>
-        <w:numPr>
-          <w:ilvl w:val="0"/>
-          <w:numId w:val="1"/>
-        </w:numPr>
-      </w:pPr>
-      <w:r>
-        <w:t>Tourist beacon</w:t>
-      </w:r>
-      <w:r>
-        <w:t xml:space="preserve">s define the </w:t>
+        <w:t xml:space="preserve">Tourist beacons define the </w:t>
       </w:r>
       <w:r>
         <w:rPr>
@@ -361,13 +309,7 @@
         <w:t>owner(s)</w:t>
       </w:r>
       <w:r>
-        <w:t xml:space="preserve"> of that </w:t>
-      </w:r>
-      <w:r>
-        <w:t>tourist beacon</w:t>
-      </w:r>
-      <w:r>
-        <w:t xml:space="preserve">, the physical </w:t>
+        <w:t xml:space="preserve"> of that beacon, the physical </w:t>
       </w:r>
       <w:r>
         <w:rPr>
@@ -377,13 +319,7 @@
         <w:t>experience area</w:t>
       </w:r>
       <w:r>
-        <w:t xml:space="preserve"> of that </w:t>
-      </w:r>
-      <w:r>
-        <w:t>tourist beacon</w:t>
-      </w:r>
-      <w:r>
-        <w:t xml:space="preserve">, and the accumulated </w:t>
+        <w:t xml:space="preserve"> of that tourist beacon, and the accumulated </w:t>
       </w:r>
       <w:r>
         <w:rPr>
@@ -397,96 +333,33 @@
       </w:r>
     </w:p>
     <w:p>
-      <w:pPr>
-        <w:numPr>
-          <w:ilvl w:val="0"/>
-          <w:numId w:val="1"/>
-        </w:numPr>
-      </w:pPr>
-      <w:r>
-        <w:t xml:space="preserve">The experience area of </w:t>
-      </w:r>
-      <w:r>
-        <w:t>a tourist beacon</w:t>
-      </w:r>
-      <w:r>
-        <w:t xml:space="preserve"> cannot overlap with the experience area of another block.</w:t>
-      </w:r>
-    </w:p>
-    <w:p>
-      <w:pPr>
-        <w:numPr>
-          <w:ilvl w:val="0"/>
-          <w:numId w:val="1"/>
-        </w:numPr>
-      </w:pPr>
-      <w:r>
-        <w:t>A tourist beacon</w:t>
-      </w:r>
-      <w:r>
-        <w:t xml:space="preserve"> can have multiple experiences. For example, a "hotel" might have a shopping experience, a dining experience, and a sleeping experience, all within the defined experience area.</w:t>
-      </w:r>
-    </w:p>
-    <w:p>
-      <w:pPr>
-        <w:numPr>
-          <w:ilvl w:val="0"/>
-          <w:numId w:val="1"/>
-        </w:numPr>
-      </w:pPr>
-      <w:r>
-        <w:t xml:space="preserve">An experience is added to </w:t>
-      </w:r>
-      <w:r>
-        <w:t>a tourist beacon</w:t>
-      </w:r>
-      <w:r>
-        <w:t xml:space="preserve"> in the form of an </w:t>
+      <w:r>
+        <w:t>The experience area of a tourist beacon cannot overlap with the experience area of another block.</w:t>
+      </w:r>
+    </w:p>
+    <w:p>
+      <w:r>
+        <w:t>A tourist beacon can have multiple experiences. For example, a "hotel" might have a shopping experience, a dining experience, and a sleeping experience, all within the defined experience area.</w:t>
+      </w:r>
+    </w:p>
+    <w:p>
+      <w:r>
+        <w:t xml:space="preserve">An experience is added to a tourist beacon in the form of an </w:t>
       </w:r>
       <w:r>
         <w:rPr>
           <w:b/>
           <w:bCs/>
         </w:rPr>
-        <w:t>E</w:t>
-      </w:r>
-      <w:r>
-        <w:rPr>
-          <w:b/>
-          <w:bCs/>
-        </w:rPr>
-        <w:t xml:space="preserve">xperience </w:t>
-      </w:r>
-      <w:r>
-        <w:rPr>
-          <w:b/>
-          <w:bCs/>
-        </w:rPr>
-        <w:t>T</w:t>
-      </w:r>
-      <w:r>
-        <w:rPr>
-          <w:b/>
-          <w:bCs/>
-        </w:rPr>
-        <w:t>emplate</w:t>
+        <w:t>experience template</w:t>
       </w:r>
       <w:r>
         <w:t xml:space="preserve"> item.</w:t>
       </w:r>
     </w:p>
     <w:p>
-      <w:pPr>
-        <w:numPr>
-          <w:ilvl w:val="0"/>
-          <w:numId w:val="1"/>
-        </w:numPr>
-      </w:pPr>
-      <w:r>
-        <w:t>A tourist beacon</w:t>
-      </w:r>
-      <w:r>
-        <w:t xml:space="preserve"> starts with a base </w:t>
+      <w:r>
+        <w:t xml:space="preserve">A tourist beacon starts with a base </w:t>
       </w:r>
       <w:r>
         <w:rPr>
@@ -496,243 +369,178 @@
         <w:t>reputation</w:t>
       </w:r>
       <w:r>
-        <w:t xml:space="preserve"> in the world, which increases as Tourists visit, play, and spend money on its experiences, and decreases if the Tourist is hurt inside </w:t>
-      </w:r>
+        <w:t xml:space="preserve"> in the world, which increases as Tourists visit, play, and spend money on its experiences, and decreases if the Tourist is hurt inside or within the vicinity of an experience area.</w:t>
+      </w:r>
+    </w:p>
+    <w:p>
+      <w:r>
+        <w:t>A tourist beacon can also gain reputation from being in the vicinity of another tourist beacon that gains reputation.</w:t>
+      </w:r>
+    </w:p>
+    <w:p>
+      <w:r>
+        <w:t>Any time that a Tourist finds itself in the same experience area as a hostile mob, the tourist beacon will lose reputation.</w:t>
+      </w:r>
+    </w:p>
+    <w:p>
+      <w:r>
+        <w:t>In general, Tourists will be willing to spend more on experiences in tourist beacons with higher reputations.</w:t>
+      </w:r>
+    </w:p>
+    <w:p>
+      <w:r>
+        <w:t>The higher the reputation of a block, the more Tourists you are likely to have on any given day.</w:t>
+      </w:r>
+    </w:p>
+    <w:p>
+      <w:r>
+        <w:t>Per-world server configuration values include:</w:t>
+      </w:r>
+    </w:p>
+    <w:p>
+      <w:pPr>
+        <w:pStyle w:val="ListParagraph"/>
+        <w:numPr>
+          <w:ilvl w:val="0"/>
+          <w:numId w:val="10"/>
+        </w:numPr>
+      </w:pPr>
+      <w:r>
+        <w:t>Maximum blocks per dimension of experience area. Default for X, Y, and Z: 64</w:t>
+      </w:r>
+    </w:p>
+    <w:p>
+      <w:pPr>
+        <w:pStyle w:val="ListParagraph"/>
+        <w:numPr>
+          <w:ilvl w:val="1"/>
+          <w:numId w:val="10"/>
+        </w:numPr>
+      </w:pPr>
+      <w:r>
+        <w:t>This can help limit storefront sizes on a busy road on a multiplayer server.</w:t>
+      </w:r>
+    </w:p>
+    <w:p>
+      <w:pPr>
+        <w:pStyle w:val="ListParagraph"/>
+        <w:numPr>
+          <w:ilvl w:val="1"/>
+          <w:numId w:val="10"/>
+        </w:numPr>
+      </w:pPr>
+      <w:r>
+        <w:t>Implementation note: Perhaps 2-dimensional areas specified by X and Z will be sufficient, at least at first.</w:t>
+      </w:r>
+    </w:p>
+    <w:p>
+      <w:pPr>
+        <w:pStyle w:val="ListParagraph"/>
+        <w:numPr>
+          <w:ilvl w:val="0"/>
+          <w:numId w:val="10"/>
+        </w:numPr>
+      </w:pPr>
+      <w:r>
+        <w:t>Maximum volume per experience area. Default: 262,144 blocks (64^3)</w:t>
+      </w:r>
+    </w:p>
+    <w:p>
+      <w:pPr>
+        <w:pStyle w:val="ListParagraph"/>
+        <w:numPr>
+          <w:ilvl w:val="1"/>
+          <w:numId w:val="10"/>
+        </w:numPr>
+      </w:pPr>
+      <w:r>
+        <w:t>This takes precedence over maximum blocks per dimension, if X * Y * Z is greater than this value.</w:t>
+      </w:r>
+    </w:p>
+    <w:p>
+      <w:pPr>
+        <w:pStyle w:val="ListParagraph"/>
+        <w:numPr>
+          <w:ilvl w:val="1"/>
+          <w:numId w:val="10"/>
+        </w:numPr>
+      </w:pPr>
+      <w:r>
+        <w:t>Implementation note: Perhaps 2-dimensional areas, with a maximum of 4096 (64^2), will be sufficient at first.</w:t>
+      </w:r>
+    </w:p>
+    <w:p>
+      <w:pPr>
+        <w:pStyle w:val="ListParagraph"/>
+        <w:numPr>
+          <w:ilvl w:val="0"/>
+          <w:numId w:val="10"/>
+        </w:numPr>
+      </w:pPr>
+      <w:r>
+        <w:t>Maximum tourist beacons per world. Default: 1024</w:t>
+      </w:r>
+    </w:p>
+    <w:p>
+      <w:pPr>
+        <w:pStyle w:val="ListParagraph"/>
+        <w:numPr>
+          <w:ilvl w:val="0"/>
+          <w:numId w:val="10"/>
+        </w:numPr>
+      </w:pPr>
+      <w:r>
+        <w:t>Maximum tourist beacons owned per player. Default: 32</w:t>
+      </w:r>
+    </w:p>
+    <w:p>
+      <w:r>
+        <w:t>All tourist beacons include in their UI the following features:</w:t>
+      </w:r>
+    </w:p>
+    <w:p>
+      <w:pPr>
+        <w:pStyle w:val="ListParagraph"/>
+        <w:numPr>
+          <w:ilvl w:val="0"/>
+          <w:numId w:val="11"/>
+        </w:numPr>
+      </w:pPr>
       <w:r>
         <w:lastRenderedPageBreak/>
-        <w:t xml:space="preserve">or within the vicinity of an experience area. </w:t>
-      </w:r>
-      <w:r>
-        <w:t>A tourist beacon</w:t>
-      </w:r>
-      <w:r>
-        <w:t xml:space="preserve"> can also gain reputation from being in the vicinity of another </w:t>
-      </w:r>
-      <w:r>
-        <w:t>tourist beacon</w:t>
-      </w:r>
-      <w:r>
-        <w:t xml:space="preserve"> that gains reputation.</w:t>
-      </w:r>
-    </w:p>
-    <w:p>
-      <w:pPr>
+        <w:t>The name of the tourist beacon (e.g. Bates Motel). Beacon blocks can be named in an anvil.</w:t>
+      </w:r>
+    </w:p>
+    <w:p>
+      <w:pPr>
+        <w:pStyle w:val="ListParagraph"/>
+        <w:numPr>
+          <w:ilvl w:val="0"/>
+          <w:numId w:val="11"/>
+        </w:numPr>
+      </w:pPr>
+      <w:r>
+        <w:t xml:space="preserve">A toggle that can be used to open/close the tourist beacon / area for business. Default is off. </w:t>
+      </w:r>
+    </w:p>
+    <w:p>
+      <w:pPr>
+        <w:pStyle w:val="ListParagraph"/>
         <w:numPr>
           <w:ilvl w:val="1"/>
-          <w:numId w:val="1"/>
-        </w:numPr>
-      </w:pPr>
-      <w:r>
-        <w:t xml:space="preserve">Any time that a Tourist finds itself in the same experience area as a hostile mob, the </w:t>
-      </w:r>
-      <w:r>
-        <w:t>tourist beacon</w:t>
-      </w:r>
-      <w:r>
-        <w:t xml:space="preserve"> will lose reputation.</w:t>
-      </w:r>
-    </w:p>
-    <w:p>
-      <w:pPr>
-        <w:numPr>
-          <w:ilvl w:val="1"/>
-          <w:numId w:val="1"/>
-        </w:numPr>
-      </w:pPr>
-      <w:r>
-        <w:t xml:space="preserve">In general, Tourists will be willing to spend more on experiences in </w:t>
-      </w:r>
-      <w:r>
-        <w:t>tourist beacon</w:t>
-      </w:r>
-      <w:r>
-        <w:t>s with higher reputations.</w:t>
-      </w:r>
-    </w:p>
-    <w:p>
-      <w:pPr>
-        <w:numPr>
-          <w:ilvl w:val="1"/>
-          <w:numId w:val="1"/>
-        </w:numPr>
-      </w:pPr>
-      <w:r>
-        <w:t>The higher the reputation of a block, the more Tourists you are likely to have on any given day.</w:t>
-      </w:r>
-    </w:p>
-    <w:p>
-      <w:pPr>
-        <w:numPr>
-          <w:ilvl w:val="0"/>
-          <w:numId w:val="1"/>
-        </w:numPr>
-      </w:pPr>
-      <w:r>
-        <w:t>Per-world server configuration values include:</w:t>
-      </w:r>
-    </w:p>
-    <w:p>
-      <w:pPr>
-        <w:numPr>
-          <w:ilvl w:val="1"/>
-          <w:numId w:val="1"/>
-        </w:numPr>
-      </w:pPr>
-      <w:r>
-        <w:t>Maximum blocks per dimension of experience area. Default for X, Y, and Z: 64</w:t>
-      </w:r>
-    </w:p>
-    <w:p>
-      <w:pPr>
-        <w:numPr>
-          <w:ilvl w:val="2"/>
-          <w:numId w:val="1"/>
-        </w:numPr>
-      </w:pPr>
-      <w:r>
-        <w:t>This can help limit storefront sizes on a busy road on a multiplayer server.</w:t>
-      </w:r>
-    </w:p>
-    <w:p>
-      <w:pPr>
-        <w:numPr>
-          <w:ilvl w:val="2"/>
-          <w:numId w:val="1"/>
-        </w:numPr>
-      </w:pPr>
-      <w:r>
-        <w:t>Implementation note: Perhaps 2-dimensional areas specified by X and Z will be sufficient, at least at first.</w:t>
-      </w:r>
-    </w:p>
-    <w:p>
-      <w:pPr>
-        <w:numPr>
-          <w:ilvl w:val="1"/>
-          <w:numId w:val="1"/>
-        </w:numPr>
-      </w:pPr>
-      <w:r>
-        <w:t>Maximum volume per experience area. Default: 262,144 blocks (64^3)</w:t>
-      </w:r>
-    </w:p>
-    <w:p>
-      <w:pPr>
-        <w:numPr>
-          <w:ilvl w:val="2"/>
-          <w:numId w:val="1"/>
-        </w:numPr>
-      </w:pPr>
-      <w:r>
-        <w:t>This takes precedence over maximum blocks per dimension, if X * Y * Z is greater than this value.</w:t>
-      </w:r>
-    </w:p>
-    <w:p>
-      <w:pPr>
-        <w:numPr>
-          <w:ilvl w:val="2"/>
-          <w:numId w:val="1"/>
-        </w:numPr>
-      </w:pPr>
-      <w:r>
-        <w:t>Implementation note: Perhaps 2-dimensional areas, with a maximum of 4096 (64^2), will be sufficient at first.</w:t>
-      </w:r>
-    </w:p>
-    <w:p>
-      <w:pPr>
-        <w:numPr>
-          <w:ilvl w:val="1"/>
-          <w:numId w:val="1"/>
-        </w:numPr>
-      </w:pPr>
-      <w:r>
-        <w:t xml:space="preserve">Maximum </w:t>
-      </w:r>
-      <w:r>
-        <w:t>tourist beacon</w:t>
-      </w:r>
-      <w:r>
-        <w:t>s per world. Default: 1024</w:t>
-      </w:r>
-    </w:p>
-    <w:p>
-      <w:pPr>
-        <w:numPr>
-          <w:ilvl w:val="1"/>
-          <w:numId w:val="1"/>
-        </w:numPr>
-      </w:pPr>
-      <w:r>
-        <w:t xml:space="preserve">Maximum </w:t>
-      </w:r>
-      <w:r>
-        <w:t>tourist beacon</w:t>
-      </w:r>
-      <w:r>
-        <w:t>s owned per player. Default: 32</w:t>
-      </w:r>
-    </w:p>
-    <w:p>
-      <w:pPr>
-        <w:numPr>
-          <w:ilvl w:val="0"/>
-          <w:numId w:val="1"/>
-        </w:numPr>
-      </w:pPr>
-      <w:r>
-        <w:t xml:space="preserve">All </w:t>
-      </w:r>
-      <w:r>
-        <w:t>tourist beacon</w:t>
-      </w:r>
-      <w:r>
-        <w:t>s include in their UI the following features:</w:t>
-      </w:r>
-    </w:p>
-    <w:p>
-      <w:pPr>
-        <w:numPr>
-          <w:ilvl w:val="1"/>
-          <w:numId w:val="1"/>
-        </w:numPr>
-      </w:pPr>
-      <w:r>
-        <w:t xml:space="preserve">A text area where the block can be given a name for the </w:t>
-      </w:r>
-      <w:r>
-        <w:t>tourist beacon</w:t>
-      </w:r>
-      <w:r>
-        <w:t xml:space="preserve"> and its area (e.g. Bates Motel).</w:t>
-      </w:r>
-    </w:p>
-    <w:p>
-      <w:pPr>
-        <w:numPr>
-          <w:ilvl w:val="1"/>
-          <w:numId w:val="1"/>
-        </w:numPr>
-      </w:pPr>
-      <w:r>
-        <w:t xml:space="preserve">A toggle that can be used to open/close the </w:t>
-      </w:r>
-      <w:r>
-        <w:t>tourist beacon</w:t>
-      </w:r>
-      <w:r>
-        <w:t xml:space="preserve"> / area for business. Default is off. Note: </w:t>
-      </w:r>
-      <w:r>
-        <w:t>a tourist beacon</w:t>
-      </w:r>
-      <w:r>
-        <w:t xml:space="preserve"> with no experiences will not attract any Tourists.</w:t>
-      </w:r>
-    </w:p>
-    <w:p>
-      <w:pPr>
-        <w:numPr>
-          <w:ilvl w:val="1"/>
-          <w:numId w:val="1"/>
+          <w:numId w:val="11"/>
+        </w:numPr>
+      </w:pPr>
+      <w:r>
+        <w:t>A tourist beacon with no experiences will still attract curious Tourists, who might visit nearby beacons afterwards.</w:t>
+      </w:r>
+    </w:p>
+    <w:p>
+      <w:pPr>
+        <w:pStyle w:val="ListParagraph"/>
+        <w:numPr>
+          <w:ilvl w:val="0"/>
+          <w:numId w:val="11"/>
         </w:numPr>
       </w:pPr>
       <w:r>
@@ -741,30 +549,25 @@
     </w:p>
     <w:p>
       <w:pPr>
-        <w:numPr>
-          <w:ilvl w:val="1"/>
-          <w:numId w:val="1"/>
-        </w:numPr>
-      </w:pPr>
-      <w:r>
-        <w:t xml:space="preserve">A scrollable list of the current balance of payments (in the form of items) that have been collected by the </w:t>
-      </w:r>
-      <w:r>
-        <w:t>tourist beacon</w:t>
-      </w:r>
-      <w:r>
-        <w:t xml:space="preserve"> from Tourists.</w:t>
-      </w:r>
-    </w:p>
-    <w:p>
-      <w:pPr>
-        <w:numPr>
-          <w:ilvl w:val="1"/>
-          <w:numId w:val="1"/>
-        </w:numPr>
-      </w:pPr>
-      <w:r>
-        <w:lastRenderedPageBreak/>
+        <w:pStyle w:val="ListParagraph"/>
+        <w:numPr>
+          <w:ilvl w:val="0"/>
+          <w:numId w:val="11"/>
+        </w:numPr>
+      </w:pPr>
+      <w:r>
+        <w:t>A small inventory for item payments that Tourists have made.</w:t>
+      </w:r>
+    </w:p>
+    <w:p>
+      <w:pPr>
+        <w:pStyle w:val="ListParagraph"/>
+        <w:numPr>
+          <w:ilvl w:val="0"/>
+          <w:numId w:val="11"/>
+        </w:numPr>
+      </w:pPr>
+      <w:r>
         <w:t xml:space="preserve">A slot where an </w:t>
       </w:r>
       <w:r>
@@ -775,65 +578,64 @@
         <w:t>Experience Key</w:t>
       </w:r>
       <w:r>
-        <w:t xml:space="preserve"> item can be picked up (or returned) by an owner. </w:t>
-      </w:r>
-      <w:r>
-        <w:t>A tourist beacon</w:t>
-      </w:r>
-      <w:r>
-        <w:t xml:space="preserve"> can provide an infinite number of keys.</w:t>
-      </w:r>
-    </w:p>
-    <w:p>
-      <w:pPr>
+        <w:t xml:space="preserve"> item can be picked up (or returned) by an owner. A tourist beacon can provide an infinite number of keys.</w:t>
+      </w:r>
+    </w:p>
+    <w:p>
+      <w:pPr>
+        <w:pStyle w:val="ListParagraph"/>
         <w:numPr>
           <w:ilvl w:val="1"/>
-          <w:numId w:val="1"/>
-        </w:numPr>
-      </w:pPr>
-      <w:r>
-        <w:t>Tab positions where experience templates can be placed.</w:t>
-      </w:r>
-    </w:p>
-    <w:p>
-      <w:pPr>
-        <w:numPr>
-          <w:ilvl w:val="0"/>
-          <w:numId w:val="1"/>
-        </w:numPr>
-      </w:pPr>
-      <w:r>
-        <w:t>Tourist beacons support two experiences by default. They can be upgraded to support more.</w:t>
-      </w:r>
-    </w:p>
-    <w:p>
-      <w:pPr>
-        <w:numPr>
-          <w:ilvl w:val="0"/>
-          <w:numId w:val="1"/>
-        </w:numPr>
-      </w:pPr>
-      <w:r>
-        <w:t xml:space="preserve">Each experience typically adds features to the </w:t>
-      </w:r>
-      <w:r>
-        <w:t>tourist beacon</w:t>
-      </w:r>
-      <w:r>
-        <w:t xml:space="preserve"> UI. For example, play experiences and sleeping experiences add the means for an owner to define the items and their amounts that they will accept as payment from a Tourist for the experience.</w:t>
-      </w:r>
-    </w:p>
-    <w:p>
-      <w:pPr>
-        <w:numPr>
-          <w:ilvl w:val="0"/>
-          <w:numId w:val="1"/>
-        </w:numPr>
-      </w:pPr>
+          <w:numId w:val="11"/>
+        </w:numPr>
+      </w:pPr>
+      <w:r>
+        <w:t>Implementation note: OR, keys have to be crafted and placed in a slot in the beacon by its owner to activate them for that beacon.</w:t>
+      </w:r>
+    </w:p>
+    <w:p>
+      <w:pPr>
+        <w:pStyle w:val="ListParagraph"/>
+        <w:numPr>
+          <w:ilvl w:val="0"/>
+          <w:numId w:val="11"/>
+        </w:numPr>
+      </w:pPr>
+      <w:r>
+        <w:t>Tab positions where experience templates can be placed. Each experience typically adds features to the tourist beacon UI. For example, play experiences and sleeping experiences add the means for an owner to define the items and their amounts that they will accept as payment from a Tourist for the experience.</w:t>
+      </w:r>
+    </w:p>
+    <w:p>
+      <w:pPr>
+        <w:pStyle w:val="ListParagraph"/>
+        <w:numPr>
+          <w:ilvl w:val="0"/>
+          <w:numId w:val="11"/>
+        </w:numPr>
+      </w:pPr>
+      <w:r>
+        <w:t>On/off toggles for each experience.</w:t>
+      </w:r>
+    </w:p>
+    <w:p>
+      <w:r>
+        <w:t>Tourist beacons support two experiences by default.</w:t>
+      </w:r>
+    </w:p>
+    <w:p>
+      <w:r>
+        <w:t>They can be upgraded to support more.</w:t>
+      </w:r>
+    </w:p>
+    <w:p>
       <w:r>
         <w:t xml:space="preserve">An </w:t>
       </w:r>
       <w:r>
+        <w:rPr>
+          <w:b/>
+          <w:bCs/>
+        </w:rPr>
         <w:t>experience key</w:t>
       </w:r>
       <w:r>
@@ -842,71 +644,58 @@
     </w:p>
     <w:p>
       <w:pPr>
+        <w:pStyle w:val="ListParagraph"/>
+        <w:numPr>
+          <w:ilvl w:val="0"/>
+          <w:numId w:val="12"/>
+        </w:numPr>
+      </w:pPr>
+      <w:r>
+        <w:t>Each key is assigned to a single tourist beacon.</w:t>
+      </w:r>
+    </w:p>
+    <w:p>
+      <w:pPr>
+        <w:pStyle w:val="ListParagraph"/>
+        <w:numPr>
+          <w:ilvl w:val="0"/>
+          <w:numId w:val="12"/>
+        </w:numPr>
+      </w:pPr>
+      <w:r>
+        <w:t>Only owners can pick up keys.</w:t>
+      </w:r>
+    </w:p>
+    <w:p>
+      <w:pPr>
+        <w:pStyle w:val="ListParagraph"/>
+        <w:numPr>
+          <w:ilvl w:val="0"/>
+          <w:numId w:val="12"/>
+        </w:numPr>
+      </w:pPr>
+      <w:r>
+        <w:t>An infinite number of keys can be picked up from a tourist beacon by any owner.</w:t>
+      </w:r>
+    </w:p>
+    <w:p>
+      <w:pPr>
+        <w:pStyle w:val="ListParagraph"/>
+        <w:numPr>
+          <w:ilvl w:val="0"/>
+          <w:numId w:val="12"/>
+        </w:numPr>
+      </w:pPr>
+      <w:r>
+        <w:t>Keys configure the 3-dimensional volume that belongs to that tourist beacon. This volume represents the shop floor, dining area, play area, sleeping area, etc. where the experiences take place.</w:t>
+      </w:r>
+    </w:p>
+    <w:p>
+      <w:pPr>
+        <w:pStyle w:val="ListParagraph"/>
         <w:numPr>
           <w:ilvl w:val="1"/>
-          <w:numId w:val="1"/>
-        </w:numPr>
-      </w:pPr>
-      <w:r>
-        <w:t xml:space="preserve">Each key is assigned to a single </w:t>
-      </w:r>
-      <w:r>
-        <w:t>tourist beacon</w:t>
-      </w:r>
-      <w:r>
-        <w:t>.</w:t>
-      </w:r>
-    </w:p>
-    <w:p>
-      <w:pPr>
-        <w:numPr>
-          <w:ilvl w:val="1"/>
-          <w:numId w:val="1"/>
-        </w:numPr>
-      </w:pPr>
-      <w:r>
-        <w:t>Only owners can pick up keys.</w:t>
-      </w:r>
-    </w:p>
-    <w:p>
-      <w:pPr>
-        <w:numPr>
-          <w:ilvl w:val="1"/>
-          <w:numId w:val="1"/>
-        </w:numPr>
-      </w:pPr>
-      <w:r>
-        <w:t xml:space="preserve">An infinite number of keys can be picked up from </w:t>
-      </w:r>
-      <w:r>
-        <w:t>a tourist beacon</w:t>
-      </w:r>
-      <w:r>
-        <w:t xml:space="preserve"> by any owner.</w:t>
-      </w:r>
-    </w:p>
-    <w:p>
-      <w:pPr>
-        <w:numPr>
-          <w:ilvl w:val="1"/>
-          <w:numId w:val="1"/>
-        </w:numPr>
-      </w:pPr>
-      <w:r>
-        <w:t xml:space="preserve">Keys configure the 3-dimensional volume that belongs to that </w:t>
-      </w:r>
-      <w:r>
-        <w:t>tourist beacon</w:t>
-      </w:r>
-      <w:r>
-        <w:t>. This volume represents the shop floor, dining area, play area, sleeping area, etc. where the experiences take place.</w:t>
-      </w:r>
-    </w:p>
-    <w:p>
-      <w:pPr>
-        <w:numPr>
-          <w:ilvl w:val="2"/>
-          <w:numId w:val="1"/>
+          <w:numId w:val="12"/>
         </w:numPr>
       </w:pPr>
       <w:r>
@@ -915,36 +704,26 @@
     </w:p>
     <w:p>
       <w:pPr>
-        <w:numPr>
-          <w:ilvl w:val="1"/>
-          <w:numId w:val="1"/>
-        </w:numPr>
-      </w:pPr>
-      <w:r>
-        <w:t xml:space="preserve">Keys for some </w:t>
-      </w:r>
-      <w:r>
-        <w:t>tourist beacon</w:t>
-      </w:r>
-      <w:r>
-        <w:t>s are used to assign the value of all items in a supported container within the experience area. For example, a key to an experience area containing a shopping experience can be used on a supported container / display case to define the value of all items for sale in that container.</w:t>
-      </w:r>
-    </w:p>
-    <w:p>
-      <w:pPr>
-        <w:numPr>
-          <w:ilvl w:val="1"/>
-          <w:numId w:val="1"/>
-        </w:numPr>
-      </w:pPr>
-      <w:r>
-        <w:t xml:space="preserve">Keys can be used to assign (or take away) co-ownership of </w:t>
-      </w:r>
-      <w:r>
-        <w:t>a tourist beacon</w:t>
-      </w:r>
-      <w:r>
-        <w:t xml:space="preserve"> to another player. By default, only the </w:t>
+        <w:pStyle w:val="ListParagraph"/>
+        <w:numPr>
+          <w:ilvl w:val="0"/>
+          <w:numId w:val="12"/>
+        </w:numPr>
+      </w:pPr>
+      <w:r>
+        <w:t>Keys for some tourist beacons are used to assign the value of all items in a supported container within the experience area. For example, a key to an experience area containing a shopping experience can be used on a supported container / display case to define the value of all items for sale in that container.</w:t>
+      </w:r>
+    </w:p>
+    <w:p>
+      <w:pPr>
+        <w:pStyle w:val="ListParagraph"/>
+        <w:numPr>
+          <w:ilvl w:val="0"/>
+          <w:numId w:val="12"/>
+        </w:numPr>
+      </w:pPr>
+      <w:r>
+        <w:t xml:space="preserve">Keys can be used to assign (or take away) co-ownership of a tourist beacon to another player. By default, only the </w:t>
       </w:r>
       <w:r>
         <w:rPr>
@@ -954,19 +733,11 @@
         <w:t>original owner</w:t>
       </w:r>
       <w:r>
-        <w:t xml:space="preserve"> of </w:t>
-      </w:r>
-      <w:r>
-        <w:t>a tourist beacon</w:t>
-      </w:r>
-      <w:r>
-        <w:t xml:space="preserve"> can use a key in-game to give or take away co-ownership of </w:t>
-      </w:r>
-      <w:r>
-        <w:t>a tourist beacon</w:t>
-      </w:r>
-      <w:r>
-        <w:t xml:space="preserve">. This is done by </w:t>
+        <w:t xml:space="preserve"> of a tourist beacon can use a key in-game to </w:t>
+      </w:r>
+      <w:r>
+        <w:lastRenderedPageBreak/>
+        <w:t xml:space="preserve">give or take away co-ownership of a tourist beacon. This is done by </w:t>
       </w:r>
       <w:r>
         <w:rPr>
@@ -981,66 +752,37 @@
     </w:p>
     <w:p>
       <w:pPr>
-        <w:numPr>
-          <w:ilvl w:val="1"/>
-          <w:numId w:val="1"/>
-        </w:numPr>
-      </w:pPr>
-      <w:r>
-        <w:t xml:space="preserve">Keys only function for owners and co-owners. If a player who is not an owner of </w:t>
-      </w:r>
-      <w:r>
-        <w:t>a tourist beacon</w:t>
-      </w:r>
-      <w:r>
-        <w:t xml:space="preserve"> gets hold of a key, it is useless.</w:t>
-      </w:r>
-    </w:p>
-    <w:p>
-      <w:pPr>
-        <w:numPr>
-          <w:ilvl w:val="0"/>
-          <w:numId w:val="1"/>
-        </w:numPr>
-      </w:pPr>
+        <w:pStyle w:val="ListParagraph"/>
+        <w:numPr>
+          <w:ilvl w:val="0"/>
+          <w:numId w:val="12"/>
+        </w:numPr>
+      </w:pPr>
+      <w:r>
+        <w:t>Keys only function for owners and co-owners. If a player who is not an owner of a tourist beacon gets hold of a key, it is useless.</w:t>
+      </w:r>
+    </w:p>
+    <w:p>
       <w:r>
         <w:t>Commands are available to server ops and original owners of experience areas to add and remove co-owners of an experience area, and to transfer primary ownership.</w:t>
       </w:r>
     </w:p>
     <w:p>
-      <w:pPr>
-        <w:numPr>
-          <w:ilvl w:val="0"/>
-          <w:numId w:val="1"/>
-        </w:numPr>
-      </w:pPr>
-      <w:r>
-        <w:lastRenderedPageBreak/>
-        <w:t xml:space="preserve">In general, any owner can set the current prices for experiences defined in </w:t>
-      </w:r>
-      <w:r>
-        <w:t>a tourist beacon</w:t>
-      </w:r>
-      <w:r>
-        <w:t>. However, Tourists come with a budget they can spend per day, so if the price is too high, players might not get any sales.</w:t>
-      </w:r>
-    </w:p>
-    <w:p>
-      <w:pPr>
-        <w:numPr>
-          <w:ilvl w:val="0"/>
-          <w:numId w:val="1"/>
-        </w:numPr>
-      </w:pPr>
+      <w:r>
+        <w:t>In general, any owner can set the current prices for experiences defined in a tourist beacon. However, Tourists come with a budget they can spend per day, so if the price is too high, players might not get any sales.</w:t>
+      </w:r>
+    </w:p>
+    <w:p>
       <w:r>
         <w:t>The following can typically be used when setting prices that an owner will accept as payment:</w:t>
       </w:r>
     </w:p>
     <w:p>
       <w:pPr>
-        <w:numPr>
-          <w:ilvl w:val="1"/>
-          <w:numId w:val="1"/>
+        <w:pStyle w:val="ListParagraph"/>
+        <w:numPr>
+          <w:ilvl w:val="0"/>
+          <w:numId w:val="13"/>
         </w:numPr>
       </w:pPr>
       <w:r>
@@ -1049,9 +791,10 @@
     </w:p>
     <w:p>
       <w:pPr>
-        <w:numPr>
-          <w:ilvl w:val="1"/>
-          <w:numId w:val="1"/>
+        <w:pStyle w:val="ListParagraph"/>
+        <w:numPr>
+          <w:ilvl w:val="0"/>
+          <w:numId w:val="13"/>
         </w:numPr>
       </w:pPr>
       <w:r>
@@ -1067,40 +810,16 @@
       </w:r>
     </w:p>
     <w:p>
-      <w:pPr>
-        <w:numPr>
-          <w:ilvl w:val="0"/>
-          <w:numId w:val="1"/>
-        </w:numPr>
-      </w:pPr>
       <w:r>
         <w:t>If a different item than emeralds is desired as payment, there's a chance that a Tourist will be able to pay using that item and its quantity, depending on a value lookup table.</w:t>
       </w:r>
     </w:p>
     <w:p>
-      <w:pPr>
-        <w:numPr>
-          <w:ilvl w:val="0"/>
-          <w:numId w:val="1"/>
-        </w:numPr>
-      </w:pPr>
-      <w:r>
-        <w:t xml:space="preserve">As Tourists pay for their experience, the </w:t>
-      </w:r>
-      <w:r>
-        <w:t>tourist beacon</w:t>
-      </w:r>
-      <w:r>
-        <w:t xml:space="preserve"> records the payment, updating the balance that's stored with the block. </w:t>
-      </w:r>
-    </w:p>
-    <w:p>
-      <w:pPr>
-        <w:numPr>
-          <w:ilvl w:val="0"/>
-          <w:numId w:val="1"/>
-        </w:numPr>
-      </w:pPr>
+      <w:r>
+        <w:t xml:space="preserve">As Tourists pay for their experience, the tourist beacon records the payment, updating the balance that's stored with the block. </w:t>
+      </w:r>
+    </w:p>
+    <w:p>
       <w:r>
         <w:t xml:space="preserve">A </w:t>
       </w:r>
@@ -1109,95 +828,50 @@
           <w:b/>
           <w:bCs/>
         </w:rPr>
-        <w:t>S</w:t>
+        <w:t xml:space="preserve">safe </w:t>
+      </w:r>
+      <w:r>
+        <w:t>block provides access to all of the items stored as payment in the account representing all of the tourist beacons owned or co-owned by the player. It can be placed anywhere in the world. When placed, a safe provides access to that balance in the form of inventory that can be "withdrawn" from the balance and placed into the player's inventory.</w:t>
+      </w:r>
+    </w:p>
+    <w:p>
+      <w:r>
+        <w:t xml:space="preserve">A </w:t>
       </w:r>
       <w:r>
         <w:rPr>
           <w:b/>
           <w:bCs/>
         </w:rPr>
-        <w:t xml:space="preserve">afe </w:t>
-      </w:r>
-      <w:r>
-        <w:t xml:space="preserve">block provides access to all of the items stored as payment in the account representing all of the </w:t>
-      </w:r>
-      <w:r>
-        <w:t>tourist beacon</w:t>
-      </w:r>
-      <w:r>
-        <w:t>s owned or co-owned by the player. It can be placed anywhere in the world. When placed, a safe provides access to that balance in the form of inventory that can be "withdrawn" from the balance and placed into the player's inventory.</w:t>
-      </w:r>
-    </w:p>
-    <w:p>
-      <w:pPr>
-        <w:numPr>
-          <w:ilvl w:val="0"/>
-          <w:numId w:val="1"/>
-        </w:numPr>
-      </w:pPr>
-      <w:r>
-        <w:t xml:space="preserve">A </w:t>
-      </w:r>
-      <w:r>
-        <w:rPr>
-          <w:b/>
-          <w:bCs/>
-        </w:rPr>
-        <w:t>W</w:t>
-      </w:r>
-      <w:r>
-        <w:rPr>
-          <w:b/>
-          <w:bCs/>
-        </w:rPr>
-        <w:t>allet</w:t>
-      </w:r>
-      <w:r>
-        <w:t xml:space="preserve"> item provides access specifically to emeralds stored in the account representing all of the </w:t>
-      </w:r>
-      <w:r>
-        <w:t>tourist beacon</w:t>
-      </w:r>
-      <w:r>
-        <w:t>s owned or co-owned by the player.</w:t>
-      </w:r>
-    </w:p>
-    <w:p>
-      <w:pPr>
-        <w:numPr>
-          <w:ilvl w:val="0"/>
-          <w:numId w:val="1"/>
-        </w:numPr>
-      </w:pPr>
-      <w:r>
-        <w:t xml:space="preserve">All critical information for every </w:t>
-      </w:r>
-      <w:r>
-        <w:t>tourist beacon</w:t>
-      </w:r>
-      <w:r>
-        <w:t xml:space="preserve"> is stored in a per-world configuration file. This includes the following:</w:t>
-      </w:r>
-    </w:p>
-    <w:p>
-      <w:pPr>
-        <w:numPr>
-          <w:ilvl w:val="1"/>
-          <w:numId w:val="1"/>
-        </w:numPr>
-      </w:pPr>
-      <w:r>
-        <w:t xml:space="preserve">UUID of the </w:t>
-      </w:r>
-      <w:r>
-        <w:t>tourist beacon</w:t>
-      </w:r>
-    </w:p>
-    <w:p>
-      <w:pPr>
-        <w:numPr>
-          <w:ilvl w:val="1"/>
-          <w:numId w:val="1"/>
+        <w:t>wallet</w:t>
+      </w:r>
+      <w:r>
+        <w:t xml:space="preserve"> item provides access specifically to emeralds stored in the account representing all of the tourist beacons owned or co-owned by the player.</w:t>
+      </w:r>
+    </w:p>
+    <w:p>
+      <w:r>
+        <w:t>All critical information for every tourist beacon is stored in a per-world configuration file. This includes the following:</w:t>
+      </w:r>
+    </w:p>
+    <w:p>
+      <w:pPr>
+        <w:pStyle w:val="ListParagraph"/>
+        <w:numPr>
+          <w:ilvl w:val="0"/>
+          <w:numId w:val="14"/>
+        </w:numPr>
+      </w:pPr>
+      <w:r>
+        <w:t>UUID of the tourist beacon</w:t>
+      </w:r>
+    </w:p>
+    <w:p>
+      <w:pPr>
+        <w:pStyle w:val="ListParagraph"/>
+        <w:numPr>
+          <w:ilvl w:val="0"/>
+          <w:numId w:val="14"/>
         </w:numPr>
       </w:pPr>
       <w:r>
@@ -1206,9 +880,10 @@
     </w:p>
     <w:p>
       <w:pPr>
-        <w:numPr>
-          <w:ilvl w:val="1"/>
-          <w:numId w:val="1"/>
+        <w:pStyle w:val="ListParagraph"/>
+        <w:numPr>
+          <w:ilvl w:val="0"/>
+          <w:numId w:val="14"/>
         </w:numPr>
       </w:pPr>
       <w:r>
@@ -1217,9 +892,10 @@
     </w:p>
     <w:p>
       <w:pPr>
-        <w:numPr>
-          <w:ilvl w:val="1"/>
-          <w:numId w:val="1"/>
+        <w:pStyle w:val="ListParagraph"/>
+        <w:numPr>
+          <w:ilvl w:val="0"/>
+          <w:numId w:val="14"/>
         </w:numPr>
       </w:pPr>
       <w:r>
@@ -1228,39 +904,32 @@
     </w:p>
     <w:p>
       <w:pPr>
-        <w:numPr>
-          <w:ilvl w:val="1"/>
-          <w:numId w:val="1"/>
-        </w:numPr>
-      </w:pPr>
-      <w:r>
+        <w:pStyle w:val="ListParagraph"/>
+        <w:numPr>
+          <w:ilvl w:val="0"/>
+          <w:numId w:val="14"/>
+        </w:numPr>
+      </w:pPr>
+      <w:r>
+        <w:lastRenderedPageBreak/>
         <w:t>Definition of the physical area of the experience</w:t>
       </w:r>
     </w:p>
     <w:p>
       <w:pPr>
-        <w:numPr>
-          <w:ilvl w:val="1"/>
-          <w:numId w:val="1"/>
-        </w:numPr>
-      </w:pPr>
-      <w:r>
-        <w:lastRenderedPageBreak/>
+        <w:pStyle w:val="ListParagraph"/>
+        <w:numPr>
+          <w:ilvl w:val="0"/>
+          <w:numId w:val="14"/>
+        </w:numPr>
+      </w:pPr>
+      <w:r>
         <w:t>Current balance</w:t>
       </w:r>
     </w:p>
     <w:p>
-      <w:pPr>
-        <w:numPr>
-          <w:ilvl w:val="0"/>
-          <w:numId w:val="1"/>
-        </w:numPr>
-      </w:pPr>
-      <w:r>
-        <w:t>Tourist beacon</w:t>
-      </w:r>
-      <w:r>
-        <w:t xml:space="preserve">s are indestructible by normal means (e.g. by explosions) while in block form, however the blocks are mineable to allow moving to different locations. </w:t>
+      <w:r>
+        <w:t xml:space="preserve">Tourist beacons are indestructible by normal means (e.g. by explosions) while in block form, however the blocks are mineable to allow moving to different locations. </w:t>
       </w:r>
       <w:proofErr w:type="gramStart"/>
       <w:r>
@@ -1272,76 +941,26 @@
       </w:r>
     </w:p>
     <w:p>
-      <w:pPr>
-        <w:numPr>
-          <w:ilvl w:val="0"/>
-          <w:numId w:val="1"/>
-        </w:numPr>
-      </w:pPr>
-      <w:r>
-        <w:t xml:space="preserve">When </w:t>
-      </w:r>
-      <w:r>
-        <w:t>a tourist beacon</w:t>
-      </w:r>
-      <w:r>
-        <w:t xml:space="preserve"> is in block item form, or if it is deleted from the world, its experiences are effectively "closed for business" and the physical area of the </w:t>
-      </w:r>
-      <w:r>
-        <w:t>tourist beacon</w:t>
-      </w:r>
-      <w:r>
-        <w:t xml:space="preserve"> becomes available for other </w:t>
-      </w:r>
-      <w:r>
-        <w:t>tourist beacon</w:t>
-      </w:r>
-      <w:r>
-        <w:t>s.</w:t>
-      </w:r>
-    </w:p>
-    <w:p>
-      <w:pPr>
-        <w:numPr>
-          <w:ilvl w:val="0"/>
-          <w:numId w:val="1"/>
-        </w:numPr>
-      </w:pPr>
-      <w:r>
-        <w:t>A tourist beacon</w:t>
-      </w:r>
-      <w:r>
-        <w:t xml:space="preserve"> that has been removed from a world can be recreated by a player with op permissions. However, if any part of the experience area now overlaps with the experience area of another </w:t>
-      </w:r>
-      <w:r>
-        <w:t>tourist beacon</w:t>
-      </w:r>
-      <w:r>
-        <w:t xml:space="preserve">, the experience area is considered invalid when the block is placed (i.e. the area cannot open for business), and either the experience area must be redefined using an Experience Key, or the other </w:t>
-      </w:r>
-      <w:r>
-        <w:t>tourist beacon</w:t>
-      </w:r>
-      <w:r>
-        <w:t xml:space="preserve"> must be removed or its experience area adjusted so that it no longer overlaps.</w:t>
-      </w:r>
-    </w:p>
-    <w:p>
-      <w:pPr>
-        <w:numPr>
-          <w:ilvl w:val="0"/>
-          <w:numId w:val="1"/>
-        </w:numPr>
-      </w:pPr>
+      <w:r>
+        <w:t>When a tourist beacon is in block item form, or if it is deleted from the world, its experiences are effectively "closed for business" and the physical area of the tourist beacon becomes available for other tourist beacons.</w:t>
+      </w:r>
+    </w:p>
+    <w:p>
+      <w:r>
+        <w:t>A tourist beacon that has been removed from a world can be recreated by a player with op permissions. However, if any part of the experience area now overlaps with the experience area of another tourist beacon, the experience area is considered invalid when the block is placed (i.e. the area cannot open for business), and either the experience area must be redefined using an Experience Key, or the other tourist beacon must be removed or its experience area adjusted so that it no longer overlaps.</w:t>
+      </w:r>
+    </w:p>
+    <w:p>
       <w:r>
         <w:t>Spending characteristics that define each Tourist:</w:t>
       </w:r>
     </w:p>
     <w:p>
       <w:pPr>
-        <w:numPr>
-          <w:ilvl w:val="1"/>
-          <w:numId w:val="1"/>
+        <w:pStyle w:val="ListParagraph"/>
+        <w:numPr>
+          <w:ilvl w:val="0"/>
+          <w:numId w:val="15"/>
         </w:numPr>
       </w:pPr>
       <w:r>
@@ -1350,9 +969,10 @@
     </w:p>
     <w:p>
       <w:pPr>
-        <w:numPr>
-          <w:ilvl w:val="1"/>
-          <w:numId w:val="1"/>
+        <w:pStyle w:val="ListParagraph"/>
+        <w:numPr>
+          <w:ilvl w:val="0"/>
+          <w:numId w:val="15"/>
         </w:numPr>
       </w:pPr>
       <w:r>
@@ -1361,9 +981,10 @@
     </w:p>
     <w:p>
       <w:pPr>
-        <w:numPr>
-          <w:ilvl w:val="1"/>
-          <w:numId w:val="1"/>
+        <w:pStyle w:val="ListParagraph"/>
+        <w:numPr>
+          <w:ilvl w:val="0"/>
+          <w:numId w:val="15"/>
         </w:numPr>
       </w:pPr>
       <w:r>
@@ -1371,12 +992,6 @@
       </w:r>
     </w:p>
     <w:p>
-      <w:pPr>
-        <w:numPr>
-          <w:ilvl w:val="0"/>
-          <w:numId w:val="1"/>
-        </w:numPr>
-      </w:pPr>
       <w:r>
         <w:t>Tourist value system, where a copper ingot has a value of 1:</w:t>
       </w:r>
@@ -1719,21 +1334,155 @@
       </w:tr>
     </w:tbl>
     <w:p>
-      <w:pPr>
-        <w:numPr>
-          <w:ilvl w:val="0"/>
-          <w:numId w:val="2"/>
-        </w:numPr>
-      </w:pPr>
+      <w:r>
+        <w:t xml:space="preserve">When tourists have a bad experience (e.g. entire beacon closed when they arrive, got hurt, etc.) emit </w:t>
+      </w:r>
+      <w:proofErr w:type="spellStart"/>
+      <w:r>
+        <w:t>redstone</w:t>
+      </w:r>
+      <w:proofErr w:type="spellEnd"/>
+      <w:r>
+        <w:t xml:space="preserve"> signal using the severity as the level.</w:t>
+      </w:r>
+    </w:p>
+    <w:p>
+      <w:r>
+        <w:t>Weather affects tourist spawn planning and scheduled spawns for outdoor activities (i.e. tourists might cancel their planned visit).</w:t>
+      </w:r>
+    </w:p>
+    <w:p>
+      <w:pPr>
+        <w:pStyle w:val="ListParagraph"/>
+        <w:numPr>
+          <w:ilvl w:val="0"/>
+          <w:numId w:val="16"/>
+        </w:numPr>
+      </w:pPr>
+      <w:r>
+        <w:t>Idea: Maybe biomes + season of the year</w:t>
+      </w:r>
+    </w:p>
+    <w:p>
+      <w:r>
+        <w:t>Advancement ideas:</w:t>
+      </w:r>
+    </w:p>
+    <w:p>
+      <w:pPr>
+        <w:pStyle w:val="ListParagraph"/>
+        <w:numPr>
+          <w:ilvl w:val="0"/>
+          <w:numId w:val="16"/>
+        </w:numPr>
+      </w:pPr>
+      <w:r>
+        <w:t>"Sketchy neighborhood": X number of failed spawns / day</w:t>
+      </w:r>
+    </w:p>
+    <w:p>
+      <w:r>
+        <w:t>Add particle effects and/or floating ender eye on beacon when it's open for business.</w:t>
+      </w:r>
+    </w:p>
+    <w:p>
+      <w:r>
+        <w:t>Tourists sometimes hold a map when travelling to a beacon or planning next move.</w:t>
+      </w:r>
+    </w:p>
+    <w:p>
+      <w:r>
+        <w:t>Tourists can get tired and look for resting experiences or places to sit, like bench seats.</w:t>
+      </w:r>
+    </w:p>
+    <w:p>
+      <w:r>
+        <w:t>Tourists can have kids at hotels.</w:t>
+      </w:r>
+    </w:p>
+    <w:p>
+      <w:r>
+        <w:t>Implement random colors for tourist clothing.</w:t>
+      </w:r>
+    </w:p>
+    <w:p>
+      <w:r>
+        <w:t>Add tourist show-info command.</w:t>
+      </w:r>
+    </w:p>
+    <w:p>
+      <w:r>
+        <w:t>Tourists make ambient noises while wandering.</w:t>
+      </w:r>
+    </w:p>
+    <w:p>
+      <w:r>
+        <w:t xml:space="preserve">Overhaul </w:t>
+      </w:r>
+      <w:proofErr w:type="spellStart"/>
+      <w:r>
+        <w:t>VisitResult</w:t>
+      </w:r>
+      <w:proofErr w:type="spellEnd"/>
+      <w:r>
+        <w:t xml:space="preserve"> system. Consider adding </w:t>
+      </w:r>
+      <w:proofErr w:type="spellStart"/>
+      <w:r>
+        <w:t>MoodResult</w:t>
+      </w:r>
+      <w:proofErr w:type="spellEnd"/>
+      <w:r>
+        <w:t>, or using different names.</w:t>
+      </w:r>
+    </w:p>
+    <w:p>
       <w:r>
         <w:t>Future version ideas:</w:t>
       </w:r>
     </w:p>
     <w:p>
       <w:pPr>
-        <w:numPr>
-          <w:ilvl w:val="1"/>
-          <w:numId w:val="2"/>
+        <w:pStyle w:val="ListParagraph"/>
+        <w:numPr>
+          <w:ilvl w:val="0"/>
+          <w:numId w:val="9"/>
+        </w:numPr>
+      </w:pPr>
+      <w:r>
+        <w:t>Tourists maintain a memory and can return to favorite spots.</w:t>
+      </w:r>
+    </w:p>
+    <w:p>
+      <w:pPr>
+        <w:pStyle w:val="ListParagraph"/>
+        <w:numPr>
+          <w:ilvl w:val="0"/>
+          <w:numId w:val="9"/>
+        </w:numPr>
+      </w:pPr>
+      <w:r>
+        <w:t>Enable tourists to swim?</w:t>
+      </w:r>
+    </w:p>
+    <w:p>
+      <w:pPr>
+        <w:pStyle w:val="ListParagraph"/>
+        <w:numPr>
+          <w:ilvl w:val="0"/>
+          <w:numId w:val="9"/>
+        </w:numPr>
+      </w:pPr>
+      <w:r>
+        <w:t>Tourists can change poses, such as looking at entities or signs or sightseeing goals.</w:t>
+      </w:r>
+    </w:p>
+    <w:p>
+      <w:pPr>
+        <w:pStyle w:val="ListParagraph"/>
+        <w:numPr>
+          <w:ilvl w:val="0"/>
+          <w:numId w:val="9"/>
         </w:numPr>
       </w:pPr>
       <w:r>
@@ -1751,6 +1500,101 @@
       </w:r>
     </w:p>
     <w:p>
+      <w:pPr>
+        <w:pStyle w:val="ListParagraph"/>
+        <w:numPr>
+          <w:ilvl w:val="0"/>
+          <w:numId w:val="9"/>
+        </w:numPr>
+      </w:pPr>
+      <w:r>
+        <w:t>Experience owners can hire villagers to mind their store, host their restaurants, work at their entertainment centers, etc.</w:t>
+      </w:r>
+    </w:p>
+    <w:p>
+      <w:pPr>
+        <w:pStyle w:val="ListParagraph"/>
+        <w:numPr>
+          <w:ilvl w:val="0"/>
+          <w:numId w:val="9"/>
+        </w:numPr>
+      </w:pPr>
+      <w:r>
+        <w:t>Hiring takes place through posting want ads for an experience that supports it.</w:t>
+      </w:r>
+    </w:p>
+    <w:p>
+      <w:pPr>
+        <w:pStyle w:val="ListParagraph"/>
+        <w:numPr>
+          <w:ilvl w:val="0"/>
+          <w:numId w:val="9"/>
+        </w:numPr>
+      </w:pPr>
+      <w:r>
+        <w:lastRenderedPageBreak/>
+        <w:t>Tourists can trade with villagers? Set up an experience area around a Villager village that works with each vanilla Villager profession, perhaps through the vanilla profession blocks?</w:t>
+      </w:r>
+    </w:p>
+    <w:p>
+      <w:pPr>
+        <w:pStyle w:val="ListParagraph"/>
+        <w:numPr>
+          <w:ilvl w:val="0"/>
+          <w:numId w:val="9"/>
+        </w:numPr>
+      </w:pPr>
+      <w:r>
+        <w:t>Tourists have profiles describing what they most want.</w:t>
+      </w:r>
+    </w:p>
+    <w:p>
+      <w:pPr>
+        <w:pStyle w:val="ListParagraph"/>
+        <w:numPr>
+          <w:ilvl w:val="0"/>
+          <w:numId w:val="9"/>
+        </w:numPr>
+      </w:pPr>
+      <w:r>
+        <w:t>Players can trade with tourists?</w:t>
+      </w:r>
+    </w:p>
+    <w:p>
+      <w:pPr>
+        <w:pStyle w:val="ListParagraph"/>
+        <w:numPr>
+          <w:ilvl w:val="0"/>
+          <w:numId w:val="9"/>
+        </w:numPr>
+      </w:pPr>
+      <w:r>
+        <w:t>Add a "lore" book that talks about the background of the Tourist entity, how Tourist Beacons have drawn their attention, and how they teleport from the Beyond World to see what is going on in the Overworld near these beacons.</w:t>
+      </w:r>
+    </w:p>
+    <w:p>
+      <w:pPr>
+        <w:pStyle w:val="ListParagraph"/>
+        <w:numPr>
+          <w:ilvl w:val="0"/>
+          <w:numId w:val="9"/>
+        </w:numPr>
+      </w:pPr>
+      <w:r>
+        <w:t xml:space="preserve">Tourists can withdraw more emeralds from an </w:t>
+      </w:r>
+      <w:r>
+        <w:rPr>
+          <w:b/>
+          <w:bCs/>
+        </w:rPr>
+        <w:t>ATM</w:t>
+      </w:r>
+      <w:r>
+        <w:t xml:space="preserve"> block (if they're having fun!).</w:t>
+      </w:r>
+    </w:p>
+    <w:p>
       <w:r>
         <w:t> </w:t>
       </w:r>
@@ -1998,7 +1842,13 @@
         <w:t>tourist beacon</w:t>
       </w:r>
       <w:r>
-        <w:t>, owners can designate a price to play in the experience area (or make it free).</w:t>
+        <w:t xml:space="preserve">, owners can designate a price to </w:t>
+      </w:r>
+      <w:r>
+        <w:t>sightsee</w:t>
+      </w:r>
+      <w:r>
+        <w:t xml:space="preserve"> in the experience area (or make it free).</w:t>
       </w:r>
     </w:p>
     <w:p>
@@ -2287,6 +2137,345 @@
 <file path=word/numbering.xml><?xml version="1.0" encoding="utf-8"?>
 <w:numbering xmlns:wpc="http://schemas.microsoft.com/office/word/2010/wordprocessingCanvas" xmlns:cx="http://schemas.microsoft.com/office/drawing/2014/chartex" xmlns:cx1="http://schemas.microsoft.com/office/drawing/2015/9/8/chartex" xmlns:cx2="http://schemas.microsoft.com/office/drawing/2015/10/21/chartex" xmlns:cx3="http://schemas.microsoft.com/office/drawing/2016/5/9/chartex" xmlns:cx4="http://schemas.microsoft.com/office/drawing/2016/5/10/chartex" xmlns:cx5="http://schemas.microsoft.com/office/drawing/2016/5/11/chartex" xmlns:cx6="http://schemas.microsoft.com/office/drawing/2016/5/12/chartex" xmlns:cx7="http://schemas.microsoft.com/office/drawing/2016/5/13/chartex" xmlns:cx8="http://schemas.microsoft.com/office/drawing/2016/5/14/chartex" xmlns:mc="http://schemas.openxmlformats.org/markup-compatibility/2006" xmlns:aink="http://schemas.microsoft.com/office/drawing/2016/ink" xmlns:am3d="http://schemas.microsoft.com/office/drawing/2017/model3d" xmlns:o="urn:schemas-microsoft-com:office:office" xmlns:oel="http://schemas.microsoft.com/office/2019/extlst" xmlns:r="http://schemas.openxmlformats.org/officeDocument/2006/relationships" xmlns:m="http://schemas.openxmlformats.org/officeDocument/2006/math" xmlns:v="urn:schemas-microsoft-com:vml" xmlns:wp14="http://schemas.microsoft.com/office/word/2010/wordprocessingDrawing" xmlns:wp="http://schemas.openxmlformats.org/drawingml/2006/wordprocessingDrawing" xmlns:w10="urn:schemas-microsoft-com:office:word" xmlns:w="http://schemas.openxmlformats.org/wordprocessingml/2006/main" xmlns:w14="http://schemas.microsoft.com/office/word/2010/wordml" xmlns:w15="http://schemas.microsoft.com/office/word/2012/wordml" xmlns:w16cex="http://schemas.microsoft.com/office/word/2018/wordml/cex" xmlns:w16cid="http://schemas.microsoft.com/office/word/2016/wordml/cid" xmlns:w16="http://schemas.microsoft.com/office/word/2018/wordml" xmlns:w16du="http://schemas.microsoft.com/office/word/2023/wordml/word16du" xmlns:w16sdtdh="http://schemas.microsoft.com/office/word/2020/wordml/sdtdatahash" xmlns:w16sdtfl="http://schemas.microsoft.com/office/word/2024/wordml/sdtformatlock" xmlns:w16se="http://schemas.microsoft.com/office/word/2015/wordml/symex" xmlns:wpg="http://schemas.microsoft.com/office/word/2010/wordprocessingGroup" xmlns:wpi="http://schemas.microsoft.com/office/word/2010/wordprocessingInk" xmlns:wne="http://schemas.microsoft.com/office/word/2006/wordml" xmlns:wps="http://schemas.microsoft.com/office/word/2010/wordprocessingShape" mc:Ignorable="w14 w15 w16se w16cid w16 w16cex w16sdtdh w16sdtfl w16du wp14">
   <w:abstractNum w:abstractNumId="0" w15:restartNumberingAfterBreak="0">
+    <w:nsid w:val="06F8162A"/>
+    <w:multiLevelType w:val="hybridMultilevel"/>
+    <w:tmpl w:val="02B65864"/>
+    <w:lvl w:ilvl="0" w:tplc="04090001">
+      <w:start w:val="1"/>
+      <w:numFmt w:val="bullet"/>
+      <w:lvlText w:val=""/>
+      <w:lvlJc w:val="left"/>
+      <w:pPr>
+        <w:ind w:left="720" w:hanging="360"/>
+      </w:pPr>
+      <w:rPr>
+        <w:rFonts w:ascii="Symbol" w:hAnsi="Symbol" w:hint="default"/>
+      </w:rPr>
+    </w:lvl>
+    <w:lvl w:ilvl="1" w:tplc="04090003" w:tentative="1">
+      <w:start w:val="1"/>
+      <w:numFmt w:val="bullet"/>
+      <w:lvlText w:val="o"/>
+      <w:lvlJc w:val="left"/>
+      <w:pPr>
+        <w:ind w:left="1440" w:hanging="360"/>
+      </w:pPr>
+      <w:rPr>
+        <w:rFonts w:ascii="Courier New" w:hAnsi="Courier New" w:cs="Courier New" w:hint="default"/>
+      </w:rPr>
+    </w:lvl>
+    <w:lvl w:ilvl="2" w:tplc="04090005" w:tentative="1">
+      <w:start w:val="1"/>
+      <w:numFmt w:val="bullet"/>
+      <w:lvlText w:val=""/>
+      <w:lvlJc w:val="left"/>
+      <w:pPr>
+        <w:ind w:left="2160" w:hanging="360"/>
+      </w:pPr>
+      <w:rPr>
+        <w:rFonts w:ascii="Wingdings" w:hAnsi="Wingdings" w:hint="default"/>
+      </w:rPr>
+    </w:lvl>
+    <w:lvl w:ilvl="3" w:tplc="04090001" w:tentative="1">
+      <w:start w:val="1"/>
+      <w:numFmt w:val="bullet"/>
+      <w:lvlText w:val=""/>
+      <w:lvlJc w:val="left"/>
+      <w:pPr>
+        <w:ind w:left="2880" w:hanging="360"/>
+      </w:pPr>
+      <w:rPr>
+        <w:rFonts w:ascii="Symbol" w:hAnsi="Symbol" w:hint="default"/>
+      </w:rPr>
+    </w:lvl>
+    <w:lvl w:ilvl="4" w:tplc="04090003" w:tentative="1">
+      <w:start w:val="1"/>
+      <w:numFmt w:val="bullet"/>
+      <w:lvlText w:val="o"/>
+      <w:lvlJc w:val="left"/>
+      <w:pPr>
+        <w:ind w:left="3600" w:hanging="360"/>
+      </w:pPr>
+      <w:rPr>
+        <w:rFonts w:ascii="Courier New" w:hAnsi="Courier New" w:cs="Courier New" w:hint="default"/>
+      </w:rPr>
+    </w:lvl>
+    <w:lvl w:ilvl="5" w:tplc="04090005" w:tentative="1">
+      <w:start w:val="1"/>
+      <w:numFmt w:val="bullet"/>
+      <w:lvlText w:val=""/>
+      <w:lvlJc w:val="left"/>
+      <w:pPr>
+        <w:ind w:left="4320" w:hanging="360"/>
+      </w:pPr>
+      <w:rPr>
+        <w:rFonts w:ascii="Wingdings" w:hAnsi="Wingdings" w:hint="default"/>
+      </w:rPr>
+    </w:lvl>
+    <w:lvl w:ilvl="6" w:tplc="04090001" w:tentative="1">
+      <w:start w:val="1"/>
+      <w:numFmt w:val="bullet"/>
+      <w:lvlText w:val=""/>
+      <w:lvlJc w:val="left"/>
+      <w:pPr>
+        <w:ind w:left="5040" w:hanging="360"/>
+      </w:pPr>
+      <w:rPr>
+        <w:rFonts w:ascii="Symbol" w:hAnsi="Symbol" w:hint="default"/>
+      </w:rPr>
+    </w:lvl>
+    <w:lvl w:ilvl="7" w:tplc="04090003" w:tentative="1">
+      <w:start w:val="1"/>
+      <w:numFmt w:val="bullet"/>
+      <w:lvlText w:val="o"/>
+      <w:lvlJc w:val="left"/>
+      <w:pPr>
+        <w:ind w:left="5760" w:hanging="360"/>
+      </w:pPr>
+      <w:rPr>
+        <w:rFonts w:ascii="Courier New" w:hAnsi="Courier New" w:cs="Courier New" w:hint="default"/>
+      </w:rPr>
+    </w:lvl>
+    <w:lvl w:ilvl="8" w:tplc="04090005" w:tentative="1">
+      <w:start w:val="1"/>
+      <w:numFmt w:val="bullet"/>
+      <w:lvlText w:val=""/>
+      <w:lvlJc w:val="left"/>
+      <w:pPr>
+        <w:ind w:left="6480" w:hanging="360"/>
+      </w:pPr>
+      <w:rPr>
+        <w:rFonts w:ascii="Wingdings" w:hAnsi="Wingdings" w:hint="default"/>
+      </w:rPr>
+    </w:lvl>
+  </w:abstractNum>
+  <w:abstractNum w:abstractNumId="1" w15:restartNumberingAfterBreak="0">
+    <w:nsid w:val="0AA87BD1"/>
+    <w:multiLevelType w:val="hybridMultilevel"/>
+    <w:tmpl w:val="B314923A"/>
+    <w:lvl w:ilvl="0" w:tplc="04090001">
+      <w:start w:val="1"/>
+      <w:numFmt w:val="bullet"/>
+      <w:lvlText w:val=""/>
+      <w:lvlJc w:val="left"/>
+      <w:pPr>
+        <w:ind w:left="720" w:hanging="360"/>
+      </w:pPr>
+      <w:rPr>
+        <w:rFonts w:ascii="Symbol" w:hAnsi="Symbol" w:hint="default"/>
+      </w:rPr>
+    </w:lvl>
+    <w:lvl w:ilvl="1" w:tplc="04090003">
+      <w:start w:val="1"/>
+      <w:numFmt w:val="bullet"/>
+      <w:lvlText w:val="o"/>
+      <w:lvlJc w:val="left"/>
+      <w:pPr>
+        <w:ind w:left="1440" w:hanging="360"/>
+      </w:pPr>
+      <w:rPr>
+        <w:rFonts w:ascii="Courier New" w:hAnsi="Courier New" w:cs="Courier New" w:hint="default"/>
+      </w:rPr>
+    </w:lvl>
+    <w:lvl w:ilvl="2" w:tplc="04090005" w:tentative="1">
+      <w:start w:val="1"/>
+      <w:numFmt w:val="bullet"/>
+      <w:lvlText w:val=""/>
+      <w:lvlJc w:val="left"/>
+      <w:pPr>
+        <w:ind w:left="2160" w:hanging="360"/>
+      </w:pPr>
+      <w:rPr>
+        <w:rFonts w:ascii="Wingdings" w:hAnsi="Wingdings" w:hint="default"/>
+      </w:rPr>
+    </w:lvl>
+    <w:lvl w:ilvl="3" w:tplc="04090001" w:tentative="1">
+      <w:start w:val="1"/>
+      <w:numFmt w:val="bullet"/>
+      <w:lvlText w:val=""/>
+      <w:lvlJc w:val="left"/>
+      <w:pPr>
+        <w:ind w:left="2880" w:hanging="360"/>
+      </w:pPr>
+      <w:rPr>
+        <w:rFonts w:ascii="Symbol" w:hAnsi="Symbol" w:hint="default"/>
+      </w:rPr>
+    </w:lvl>
+    <w:lvl w:ilvl="4" w:tplc="04090003" w:tentative="1">
+      <w:start w:val="1"/>
+      <w:numFmt w:val="bullet"/>
+      <w:lvlText w:val="o"/>
+      <w:lvlJc w:val="left"/>
+      <w:pPr>
+        <w:ind w:left="3600" w:hanging="360"/>
+      </w:pPr>
+      <w:rPr>
+        <w:rFonts w:ascii="Courier New" w:hAnsi="Courier New" w:cs="Courier New" w:hint="default"/>
+      </w:rPr>
+    </w:lvl>
+    <w:lvl w:ilvl="5" w:tplc="04090005" w:tentative="1">
+      <w:start w:val="1"/>
+      <w:numFmt w:val="bullet"/>
+      <w:lvlText w:val=""/>
+      <w:lvlJc w:val="left"/>
+      <w:pPr>
+        <w:ind w:left="4320" w:hanging="360"/>
+      </w:pPr>
+      <w:rPr>
+        <w:rFonts w:ascii="Wingdings" w:hAnsi="Wingdings" w:hint="default"/>
+      </w:rPr>
+    </w:lvl>
+    <w:lvl w:ilvl="6" w:tplc="04090001" w:tentative="1">
+      <w:start w:val="1"/>
+      <w:numFmt w:val="bullet"/>
+      <w:lvlText w:val=""/>
+      <w:lvlJc w:val="left"/>
+      <w:pPr>
+        <w:ind w:left="5040" w:hanging="360"/>
+      </w:pPr>
+      <w:rPr>
+        <w:rFonts w:ascii="Symbol" w:hAnsi="Symbol" w:hint="default"/>
+      </w:rPr>
+    </w:lvl>
+    <w:lvl w:ilvl="7" w:tplc="04090003" w:tentative="1">
+      <w:start w:val="1"/>
+      <w:numFmt w:val="bullet"/>
+      <w:lvlText w:val="o"/>
+      <w:lvlJc w:val="left"/>
+      <w:pPr>
+        <w:ind w:left="5760" w:hanging="360"/>
+      </w:pPr>
+      <w:rPr>
+        <w:rFonts w:ascii="Courier New" w:hAnsi="Courier New" w:cs="Courier New" w:hint="default"/>
+      </w:rPr>
+    </w:lvl>
+    <w:lvl w:ilvl="8" w:tplc="04090005" w:tentative="1">
+      <w:start w:val="1"/>
+      <w:numFmt w:val="bullet"/>
+      <w:lvlText w:val=""/>
+      <w:lvlJc w:val="left"/>
+      <w:pPr>
+        <w:ind w:left="6480" w:hanging="360"/>
+      </w:pPr>
+      <w:rPr>
+        <w:rFonts w:ascii="Wingdings" w:hAnsi="Wingdings" w:hint="default"/>
+      </w:rPr>
+    </w:lvl>
+  </w:abstractNum>
+  <w:abstractNum w:abstractNumId="2" w15:restartNumberingAfterBreak="0">
+    <w:nsid w:val="0D812F4A"/>
+    <w:multiLevelType w:val="hybridMultilevel"/>
+    <w:tmpl w:val="BCA8EA44"/>
+    <w:lvl w:ilvl="0" w:tplc="04090001">
+      <w:start w:val="1"/>
+      <w:numFmt w:val="bullet"/>
+      <w:lvlText w:val=""/>
+      <w:lvlJc w:val="left"/>
+      <w:pPr>
+        <w:ind w:left="720" w:hanging="360"/>
+      </w:pPr>
+      <w:rPr>
+        <w:rFonts w:ascii="Symbol" w:hAnsi="Symbol" w:hint="default"/>
+      </w:rPr>
+    </w:lvl>
+    <w:lvl w:ilvl="1" w:tplc="04090003" w:tentative="1">
+      <w:start w:val="1"/>
+      <w:numFmt w:val="bullet"/>
+      <w:lvlText w:val="o"/>
+      <w:lvlJc w:val="left"/>
+      <w:pPr>
+        <w:ind w:left="1440" w:hanging="360"/>
+      </w:pPr>
+      <w:rPr>
+        <w:rFonts w:ascii="Courier New" w:hAnsi="Courier New" w:cs="Courier New" w:hint="default"/>
+      </w:rPr>
+    </w:lvl>
+    <w:lvl w:ilvl="2" w:tplc="04090005" w:tentative="1">
+      <w:start w:val="1"/>
+      <w:numFmt w:val="bullet"/>
+      <w:lvlText w:val=""/>
+      <w:lvlJc w:val="left"/>
+      <w:pPr>
+        <w:ind w:left="2160" w:hanging="360"/>
+      </w:pPr>
+      <w:rPr>
+        <w:rFonts w:ascii="Wingdings" w:hAnsi="Wingdings" w:hint="default"/>
+      </w:rPr>
+    </w:lvl>
+    <w:lvl w:ilvl="3" w:tplc="04090001" w:tentative="1">
+      <w:start w:val="1"/>
+      <w:numFmt w:val="bullet"/>
+      <w:lvlText w:val=""/>
+      <w:lvlJc w:val="left"/>
+      <w:pPr>
+        <w:ind w:left="2880" w:hanging="360"/>
+      </w:pPr>
+      <w:rPr>
+        <w:rFonts w:ascii="Symbol" w:hAnsi="Symbol" w:hint="default"/>
+      </w:rPr>
+    </w:lvl>
+    <w:lvl w:ilvl="4" w:tplc="04090003" w:tentative="1">
+      <w:start w:val="1"/>
+      <w:numFmt w:val="bullet"/>
+      <w:lvlText w:val="o"/>
+      <w:lvlJc w:val="left"/>
+      <w:pPr>
+        <w:ind w:left="3600" w:hanging="360"/>
+      </w:pPr>
+      <w:rPr>
+        <w:rFonts w:ascii="Courier New" w:hAnsi="Courier New" w:cs="Courier New" w:hint="default"/>
+      </w:rPr>
+    </w:lvl>
+    <w:lvl w:ilvl="5" w:tplc="04090005" w:tentative="1">
+      <w:start w:val="1"/>
+      <w:numFmt w:val="bullet"/>
+      <w:lvlText w:val=""/>
+      <w:lvlJc w:val="left"/>
+      <w:pPr>
+        <w:ind w:left="4320" w:hanging="360"/>
+      </w:pPr>
+      <w:rPr>
+        <w:rFonts w:ascii="Wingdings" w:hAnsi="Wingdings" w:hint="default"/>
+      </w:rPr>
+    </w:lvl>
+    <w:lvl w:ilvl="6" w:tplc="04090001" w:tentative="1">
+      <w:start w:val="1"/>
+      <w:numFmt w:val="bullet"/>
+      <w:lvlText w:val=""/>
+      <w:lvlJc w:val="left"/>
+      <w:pPr>
+        <w:ind w:left="5040" w:hanging="360"/>
+      </w:pPr>
+      <w:rPr>
+        <w:rFonts w:ascii="Symbol" w:hAnsi="Symbol" w:hint="default"/>
+      </w:rPr>
+    </w:lvl>
+    <w:lvl w:ilvl="7" w:tplc="04090003" w:tentative="1">
+      <w:start w:val="1"/>
+      <w:numFmt w:val="bullet"/>
+      <w:lvlText w:val="o"/>
+      <w:lvlJc w:val="left"/>
+      <w:pPr>
+        <w:ind w:left="5760" w:hanging="360"/>
+      </w:pPr>
+      <w:rPr>
+        <w:rFonts w:ascii="Courier New" w:hAnsi="Courier New" w:cs="Courier New" w:hint="default"/>
+      </w:rPr>
+    </w:lvl>
+    <w:lvl w:ilvl="8" w:tplc="04090005" w:tentative="1">
+      <w:start w:val="1"/>
+      <w:numFmt w:val="bullet"/>
+      <w:lvlText w:val=""/>
+      <w:lvlJc w:val="left"/>
+      <w:pPr>
+        <w:ind w:left="6480" w:hanging="360"/>
+      </w:pPr>
+      <w:rPr>
+        <w:rFonts w:ascii="Wingdings" w:hAnsi="Wingdings" w:hint="default"/>
+      </w:rPr>
+    </w:lvl>
+  </w:abstractNum>
+  <w:abstractNum w:abstractNumId="3" w15:restartNumberingAfterBreak="0">
     <w:nsid w:val="112A3826"/>
     <w:multiLevelType w:val="multilevel"/>
     <w:tmpl w:val="6E08C36A"/>
@@ -2435,7 +2624,7 @@
       </w:rPr>
     </w:lvl>
   </w:abstractNum>
-  <w:abstractNum w:abstractNumId="1" w15:restartNumberingAfterBreak="0">
+  <w:abstractNum w:abstractNumId="4" w15:restartNumberingAfterBreak="0">
     <w:nsid w:val="19080604"/>
     <w:multiLevelType w:val="multilevel"/>
     <w:tmpl w:val="CB0291FC"/>
@@ -2584,7 +2773,7 @@
       </w:rPr>
     </w:lvl>
   </w:abstractNum>
-  <w:abstractNum w:abstractNumId="2" w15:restartNumberingAfterBreak="0">
+  <w:abstractNum w:abstractNumId="5" w15:restartNumberingAfterBreak="0">
     <w:nsid w:val="1F0E0407"/>
     <w:multiLevelType w:val="multilevel"/>
     <w:tmpl w:val="77DE0256"/>
@@ -2733,7 +2922,7 @@
       </w:rPr>
     </w:lvl>
   </w:abstractNum>
-  <w:abstractNum w:abstractNumId="3" w15:restartNumberingAfterBreak="0">
+  <w:abstractNum w:abstractNumId="6" w15:restartNumberingAfterBreak="0">
     <w:nsid w:val="2A430C4D"/>
     <w:multiLevelType w:val="multilevel"/>
     <w:tmpl w:val="54FA52DE"/>
@@ -2882,7 +3071,233 @@
       </w:rPr>
     </w:lvl>
   </w:abstractNum>
-  <w:abstractNum w:abstractNumId="4" w15:restartNumberingAfterBreak="0">
+  <w:abstractNum w:abstractNumId="7" w15:restartNumberingAfterBreak="0">
+    <w:nsid w:val="33A3308E"/>
+    <w:multiLevelType w:val="hybridMultilevel"/>
+    <w:tmpl w:val="DED04BA8"/>
+    <w:lvl w:ilvl="0" w:tplc="04090001">
+      <w:start w:val="1"/>
+      <w:numFmt w:val="bullet"/>
+      <w:lvlText w:val=""/>
+      <w:lvlJc w:val="left"/>
+      <w:pPr>
+        <w:ind w:left="720" w:hanging="360"/>
+      </w:pPr>
+      <w:rPr>
+        <w:rFonts w:ascii="Symbol" w:hAnsi="Symbol" w:hint="default"/>
+      </w:rPr>
+    </w:lvl>
+    <w:lvl w:ilvl="1" w:tplc="04090003">
+      <w:start w:val="1"/>
+      <w:numFmt w:val="bullet"/>
+      <w:lvlText w:val="o"/>
+      <w:lvlJc w:val="left"/>
+      <w:pPr>
+        <w:ind w:left="1440" w:hanging="360"/>
+      </w:pPr>
+      <w:rPr>
+        <w:rFonts w:ascii="Courier New" w:hAnsi="Courier New" w:cs="Courier New" w:hint="default"/>
+      </w:rPr>
+    </w:lvl>
+    <w:lvl w:ilvl="2" w:tplc="04090005" w:tentative="1">
+      <w:start w:val="1"/>
+      <w:numFmt w:val="bullet"/>
+      <w:lvlText w:val=""/>
+      <w:lvlJc w:val="left"/>
+      <w:pPr>
+        <w:ind w:left="2160" w:hanging="360"/>
+      </w:pPr>
+      <w:rPr>
+        <w:rFonts w:ascii="Wingdings" w:hAnsi="Wingdings" w:hint="default"/>
+      </w:rPr>
+    </w:lvl>
+    <w:lvl w:ilvl="3" w:tplc="04090001" w:tentative="1">
+      <w:start w:val="1"/>
+      <w:numFmt w:val="bullet"/>
+      <w:lvlText w:val=""/>
+      <w:lvlJc w:val="left"/>
+      <w:pPr>
+        <w:ind w:left="2880" w:hanging="360"/>
+      </w:pPr>
+      <w:rPr>
+        <w:rFonts w:ascii="Symbol" w:hAnsi="Symbol" w:hint="default"/>
+      </w:rPr>
+    </w:lvl>
+    <w:lvl w:ilvl="4" w:tplc="04090003" w:tentative="1">
+      <w:start w:val="1"/>
+      <w:numFmt w:val="bullet"/>
+      <w:lvlText w:val="o"/>
+      <w:lvlJc w:val="left"/>
+      <w:pPr>
+        <w:ind w:left="3600" w:hanging="360"/>
+      </w:pPr>
+      <w:rPr>
+        <w:rFonts w:ascii="Courier New" w:hAnsi="Courier New" w:cs="Courier New" w:hint="default"/>
+      </w:rPr>
+    </w:lvl>
+    <w:lvl w:ilvl="5" w:tplc="04090005" w:tentative="1">
+      <w:start w:val="1"/>
+      <w:numFmt w:val="bullet"/>
+      <w:lvlText w:val=""/>
+      <w:lvlJc w:val="left"/>
+      <w:pPr>
+        <w:ind w:left="4320" w:hanging="360"/>
+      </w:pPr>
+      <w:rPr>
+        <w:rFonts w:ascii="Wingdings" w:hAnsi="Wingdings" w:hint="default"/>
+      </w:rPr>
+    </w:lvl>
+    <w:lvl w:ilvl="6" w:tplc="04090001" w:tentative="1">
+      <w:start w:val="1"/>
+      <w:numFmt w:val="bullet"/>
+      <w:lvlText w:val=""/>
+      <w:lvlJc w:val="left"/>
+      <w:pPr>
+        <w:ind w:left="5040" w:hanging="360"/>
+      </w:pPr>
+      <w:rPr>
+        <w:rFonts w:ascii="Symbol" w:hAnsi="Symbol" w:hint="default"/>
+      </w:rPr>
+    </w:lvl>
+    <w:lvl w:ilvl="7" w:tplc="04090003" w:tentative="1">
+      <w:start w:val="1"/>
+      <w:numFmt w:val="bullet"/>
+      <w:lvlText w:val="o"/>
+      <w:lvlJc w:val="left"/>
+      <w:pPr>
+        <w:ind w:left="5760" w:hanging="360"/>
+      </w:pPr>
+      <w:rPr>
+        <w:rFonts w:ascii="Courier New" w:hAnsi="Courier New" w:cs="Courier New" w:hint="default"/>
+      </w:rPr>
+    </w:lvl>
+    <w:lvl w:ilvl="8" w:tplc="04090005" w:tentative="1">
+      <w:start w:val="1"/>
+      <w:numFmt w:val="bullet"/>
+      <w:lvlText w:val=""/>
+      <w:lvlJc w:val="left"/>
+      <w:pPr>
+        <w:ind w:left="6480" w:hanging="360"/>
+      </w:pPr>
+      <w:rPr>
+        <w:rFonts w:ascii="Wingdings" w:hAnsi="Wingdings" w:hint="default"/>
+      </w:rPr>
+    </w:lvl>
+  </w:abstractNum>
+  <w:abstractNum w:abstractNumId="8" w15:restartNumberingAfterBreak="0">
+    <w:nsid w:val="35082ECC"/>
+    <w:multiLevelType w:val="hybridMultilevel"/>
+    <w:tmpl w:val="07E88AF2"/>
+    <w:lvl w:ilvl="0" w:tplc="04090001">
+      <w:start w:val="1"/>
+      <w:numFmt w:val="bullet"/>
+      <w:lvlText w:val=""/>
+      <w:lvlJc w:val="left"/>
+      <w:pPr>
+        <w:ind w:left="720" w:hanging="360"/>
+      </w:pPr>
+      <w:rPr>
+        <w:rFonts w:ascii="Symbol" w:hAnsi="Symbol" w:hint="default"/>
+      </w:rPr>
+    </w:lvl>
+    <w:lvl w:ilvl="1" w:tplc="04090003" w:tentative="1">
+      <w:start w:val="1"/>
+      <w:numFmt w:val="bullet"/>
+      <w:lvlText w:val="o"/>
+      <w:lvlJc w:val="left"/>
+      <w:pPr>
+        <w:ind w:left="1440" w:hanging="360"/>
+      </w:pPr>
+      <w:rPr>
+        <w:rFonts w:ascii="Courier New" w:hAnsi="Courier New" w:cs="Courier New" w:hint="default"/>
+      </w:rPr>
+    </w:lvl>
+    <w:lvl w:ilvl="2" w:tplc="04090005" w:tentative="1">
+      <w:start w:val="1"/>
+      <w:numFmt w:val="bullet"/>
+      <w:lvlText w:val=""/>
+      <w:lvlJc w:val="left"/>
+      <w:pPr>
+        <w:ind w:left="2160" w:hanging="360"/>
+      </w:pPr>
+      <w:rPr>
+        <w:rFonts w:ascii="Wingdings" w:hAnsi="Wingdings" w:hint="default"/>
+      </w:rPr>
+    </w:lvl>
+    <w:lvl w:ilvl="3" w:tplc="04090001" w:tentative="1">
+      <w:start w:val="1"/>
+      <w:numFmt w:val="bullet"/>
+      <w:lvlText w:val=""/>
+      <w:lvlJc w:val="left"/>
+      <w:pPr>
+        <w:ind w:left="2880" w:hanging="360"/>
+      </w:pPr>
+      <w:rPr>
+        <w:rFonts w:ascii="Symbol" w:hAnsi="Symbol" w:hint="default"/>
+      </w:rPr>
+    </w:lvl>
+    <w:lvl w:ilvl="4" w:tplc="04090003" w:tentative="1">
+      <w:start w:val="1"/>
+      <w:numFmt w:val="bullet"/>
+      <w:lvlText w:val="o"/>
+      <w:lvlJc w:val="left"/>
+      <w:pPr>
+        <w:ind w:left="3600" w:hanging="360"/>
+      </w:pPr>
+      <w:rPr>
+        <w:rFonts w:ascii="Courier New" w:hAnsi="Courier New" w:cs="Courier New" w:hint="default"/>
+      </w:rPr>
+    </w:lvl>
+    <w:lvl w:ilvl="5" w:tplc="04090005" w:tentative="1">
+      <w:start w:val="1"/>
+      <w:numFmt w:val="bullet"/>
+      <w:lvlText w:val=""/>
+      <w:lvlJc w:val="left"/>
+      <w:pPr>
+        <w:ind w:left="4320" w:hanging="360"/>
+      </w:pPr>
+      <w:rPr>
+        <w:rFonts w:ascii="Wingdings" w:hAnsi="Wingdings" w:hint="default"/>
+      </w:rPr>
+    </w:lvl>
+    <w:lvl w:ilvl="6" w:tplc="04090001" w:tentative="1">
+      <w:start w:val="1"/>
+      <w:numFmt w:val="bullet"/>
+      <w:lvlText w:val=""/>
+      <w:lvlJc w:val="left"/>
+      <w:pPr>
+        <w:ind w:left="5040" w:hanging="360"/>
+      </w:pPr>
+      <w:rPr>
+        <w:rFonts w:ascii="Symbol" w:hAnsi="Symbol" w:hint="default"/>
+      </w:rPr>
+    </w:lvl>
+    <w:lvl w:ilvl="7" w:tplc="04090003" w:tentative="1">
+      <w:start w:val="1"/>
+      <w:numFmt w:val="bullet"/>
+      <w:lvlText w:val="o"/>
+      <w:lvlJc w:val="left"/>
+      <w:pPr>
+        <w:ind w:left="5760" w:hanging="360"/>
+      </w:pPr>
+      <w:rPr>
+        <w:rFonts w:ascii="Courier New" w:hAnsi="Courier New" w:cs="Courier New" w:hint="default"/>
+      </w:rPr>
+    </w:lvl>
+    <w:lvl w:ilvl="8" w:tplc="04090005" w:tentative="1">
+      <w:start w:val="1"/>
+      <w:numFmt w:val="bullet"/>
+      <w:lvlText w:val=""/>
+      <w:lvlJc w:val="left"/>
+      <w:pPr>
+        <w:ind w:left="6480" w:hanging="360"/>
+      </w:pPr>
+      <w:rPr>
+        <w:rFonts w:ascii="Wingdings" w:hAnsi="Wingdings" w:hint="default"/>
+      </w:rPr>
+    </w:lvl>
+  </w:abstractNum>
+  <w:abstractNum w:abstractNumId="9" w15:restartNumberingAfterBreak="0">
     <w:nsid w:val="480059DA"/>
     <w:multiLevelType w:val="multilevel"/>
     <w:tmpl w:val="AF84D49C"/>
@@ -3031,7 +3446,120 @@
       </w:rPr>
     </w:lvl>
   </w:abstractNum>
-  <w:abstractNum w:abstractNumId="5" w15:restartNumberingAfterBreak="0">
+  <w:abstractNum w:abstractNumId="10" w15:restartNumberingAfterBreak="0">
+    <w:nsid w:val="54DE7E18"/>
+    <w:multiLevelType w:val="hybridMultilevel"/>
+    <w:tmpl w:val="789EA722"/>
+    <w:lvl w:ilvl="0" w:tplc="04090001">
+      <w:start w:val="1"/>
+      <w:numFmt w:val="bullet"/>
+      <w:lvlText w:val=""/>
+      <w:lvlJc w:val="left"/>
+      <w:pPr>
+        <w:ind w:left="720" w:hanging="360"/>
+      </w:pPr>
+      <w:rPr>
+        <w:rFonts w:ascii="Symbol" w:hAnsi="Symbol" w:hint="default"/>
+      </w:rPr>
+    </w:lvl>
+    <w:lvl w:ilvl="1" w:tplc="04090003">
+      <w:start w:val="1"/>
+      <w:numFmt w:val="bullet"/>
+      <w:lvlText w:val="o"/>
+      <w:lvlJc w:val="left"/>
+      <w:pPr>
+        <w:ind w:left="1440" w:hanging="360"/>
+      </w:pPr>
+      <w:rPr>
+        <w:rFonts w:ascii="Courier New" w:hAnsi="Courier New" w:cs="Courier New" w:hint="default"/>
+      </w:rPr>
+    </w:lvl>
+    <w:lvl w:ilvl="2" w:tplc="04090005" w:tentative="1">
+      <w:start w:val="1"/>
+      <w:numFmt w:val="bullet"/>
+      <w:lvlText w:val=""/>
+      <w:lvlJc w:val="left"/>
+      <w:pPr>
+        <w:ind w:left="2160" w:hanging="360"/>
+      </w:pPr>
+      <w:rPr>
+        <w:rFonts w:ascii="Wingdings" w:hAnsi="Wingdings" w:hint="default"/>
+      </w:rPr>
+    </w:lvl>
+    <w:lvl w:ilvl="3" w:tplc="04090001" w:tentative="1">
+      <w:start w:val="1"/>
+      <w:numFmt w:val="bullet"/>
+      <w:lvlText w:val=""/>
+      <w:lvlJc w:val="left"/>
+      <w:pPr>
+        <w:ind w:left="2880" w:hanging="360"/>
+      </w:pPr>
+      <w:rPr>
+        <w:rFonts w:ascii="Symbol" w:hAnsi="Symbol" w:hint="default"/>
+      </w:rPr>
+    </w:lvl>
+    <w:lvl w:ilvl="4" w:tplc="04090003" w:tentative="1">
+      <w:start w:val="1"/>
+      <w:numFmt w:val="bullet"/>
+      <w:lvlText w:val="o"/>
+      <w:lvlJc w:val="left"/>
+      <w:pPr>
+        <w:ind w:left="3600" w:hanging="360"/>
+      </w:pPr>
+      <w:rPr>
+        <w:rFonts w:ascii="Courier New" w:hAnsi="Courier New" w:cs="Courier New" w:hint="default"/>
+      </w:rPr>
+    </w:lvl>
+    <w:lvl w:ilvl="5" w:tplc="04090005" w:tentative="1">
+      <w:start w:val="1"/>
+      <w:numFmt w:val="bullet"/>
+      <w:lvlText w:val=""/>
+      <w:lvlJc w:val="left"/>
+      <w:pPr>
+        <w:ind w:left="4320" w:hanging="360"/>
+      </w:pPr>
+      <w:rPr>
+        <w:rFonts w:ascii="Wingdings" w:hAnsi="Wingdings" w:hint="default"/>
+      </w:rPr>
+    </w:lvl>
+    <w:lvl w:ilvl="6" w:tplc="04090001" w:tentative="1">
+      <w:start w:val="1"/>
+      <w:numFmt w:val="bullet"/>
+      <w:lvlText w:val=""/>
+      <w:lvlJc w:val="left"/>
+      <w:pPr>
+        <w:ind w:left="5040" w:hanging="360"/>
+      </w:pPr>
+      <w:rPr>
+        <w:rFonts w:ascii="Symbol" w:hAnsi="Symbol" w:hint="default"/>
+      </w:rPr>
+    </w:lvl>
+    <w:lvl w:ilvl="7" w:tplc="04090003" w:tentative="1">
+      <w:start w:val="1"/>
+      <w:numFmt w:val="bullet"/>
+      <w:lvlText w:val="o"/>
+      <w:lvlJc w:val="left"/>
+      <w:pPr>
+        <w:ind w:left="5760" w:hanging="360"/>
+      </w:pPr>
+      <w:rPr>
+        <w:rFonts w:ascii="Courier New" w:hAnsi="Courier New" w:cs="Courier New" w:hint="default"/>
+      </w:rPr>
+    </w:lvl>
+    <w:lvl w:ilvl="8" w:tplc="04090005" w:tentative="1">
+      <w:start w:val="1"/>
+      <w:numFmt w:val="bullet"/>
+      <w:lvlText w:val=""/>
+      <w:lvlJc w:val="left"/>
+      <w:pPr>
+        <w:ind w:left="6480" w:hanging="360"/>
+      </w:pPr>
+      <w:rPr>
+        <w:rFonts w:ascii="Wingdings" w:hAnsi="Wingdings" w:hint="default"/>
+      </w:rPr>
+    </w:lvl>
+  </w:abstractNum>
+  <w:abstractNum w:abstractNumId="11" w15:restartNumberingAfterBreak="0">
     <w:nsid w:val="596D78EB"/>
     <w:multiLevelType w:val="multilevel"/>
     <w:tmpl w:val="300478F6"/>
@@ -3180,7 +3708,233 @@
       </w:rPr>
     </w:lvl>
   </w:abstractNum>
-  <w:abstractNum w:abstractNumId="6" w15:restartNumberingAfterBreak="0">
+  <w:abstractNum w:abstractNumId="12" w15:restartNumberingAfterBreak="0">
+    <w:nsid w:val="5E1F04B0"/>
+    <w:multiLevelType w:val="hybridMultilevel"/>
+    <w:tmpl w:val="FFE807A2"/>
+    <w:lvl w:ilvl="0" w:tplc="04090001">
+      <w:start w:val="1"/>
+      <w:numFmt w:val="bullet"/>
+      <w:lvlText w:val=""/>
+      <w:lvlJc w:val="left"/>
+      <w:pPr>
+        <w:ind w:left="720" w:hanging="360"/>
+      </w:pPr>
+      <w:rPr>
+        <w:rFonts w:ascii="Symbol" w:hAnsi="Symbol" w:hint="default"/>
+      </w:rPr>
+    </w:lvl>
+    <w:lvl w:ilvl="1" w:tplc="04090003" w:tentative="1">
+      <w:start w:val="1"/>
+      <w:numFmt w:val="bullet"/>
+      <w:lvlText w:val="o"/>
+      <w:lvlJc w:val="left"/>
+      <w:pPr>
+        <w:ind w:left="1440" w:hanging="360"/>
+      </w:pPr>
+      <w:rPr>
+        <w:rFonts w:ascii="Courier New" w:hAnsi="Courier New" w:cs="Courier New" w:hint="default"/>
+      </w:rPr>
+    </w:lvl>
+    <w:lvl w:ilvl="2" w:tplc="04090005" w:tentative="1">
+      <w:start w:val="1"/>
+      <w:numFmt w:val="bullet"/>
+      <w:lvlText w:val=""/>
+      <w:lvlJc w:val="left"/>
+      <w:pPr>
+        <w:ind w:left="2160" w:hanging="360"/>
+      </w:pPr>
+      <w:rPr>
+        <w:rFonts w:ascii="Wingdings" w:hAnsi="Wingdings" w:hint="default"/>
+      </w:rPr>
+    </w:lvl>
+    <w:lvl w:ilvl="3" w:tplc="04090001" w:tentative="1">
+      <w:start w:val="1"/>
+      <w:numFmt w:val="bullet"/>
+      <w:lvlText w:val=""/>
+      <w:lvlJc w:val="left"/>
+      <w:pPr>
+        <w:ind w:left="2880" w:hanging="360"/>
+      </w:pPr>
+      <w:rPr>
+        <w:rFonts w:ascii="Symbol" w:hAnsi="Symbol" w:hint="default"/>
+      </w:rPr>
+    </w:lvl>
+    <w:lvl w:ilvl="4" w:tplc="04090003" w:tentative="1">
+      <w:start w:val="1"/>
+      <w:numFmt w:val="bullet"/>
+      <w:lvlText w:val="o"/>
+      <w:lvlJc w:val="left"/>
+      <w:pPr>
+        <w:ind w:left="3600" w:hanging="360"/>
+      </w:pPr>
+      <w:rPr>
+        <w:rFonts w:ascii="Courier New" w:hAnsi="Courier New" w:cs="Courier New" w:hint="default"/>
+      </w:rPr>
+    </w:lvl>
+    <w:lvl w:ilvl="5" w:tplc="04090005" w:tentative="1">
+      <w:start w:val="1"/>
+      <w:numFmt w:val="bullet"/>
+      <w:lvlText w:val=""/>
+      <w:lvlJc w:val="left"/>
+      <w:pPr>
+        <w:ind w:left="4320" w:hanging="360"/>
+      </w:pPr>
+      <w:rPr>
+        <w:rFonts w:ascii="Wingdings" w:hAnsi="Wingdings" w:hint="default"/>
+      </w:rPr>
+    </w:lvl>
+    <w:lvl w:ilvl="6" w:tplc="04090001" w:tentative="1">
+      <w:start w:val="1"/>
+      <w:numFmt w:val="bullet"/>
+      <w:lvlText w:val=""/>
+      <w:lvlJc w:val="left"/>
+      <w:pPr>
+        <w:ind w:left="5040" w:hanging="360"/>
+      </w:pPr>
+      <w:rPr>
+        <w:rFonts w:ascii="Symbol" w:hAnsi="Symbol" w:hint="default"/>
+      </w:rPr>
+    </w:lvl>
+    <w:lvl w:ilvl="7" w:tplc="04090003" w:tentative="1">
+      <w:start w:val="1"/>
+      <w:numFmt w:val="bullet"/>
+      <w:lvlText w:val="o"/>
+      <w:lvlJc w:val="left"/>
+      <w:pPr>
+        <w:ind w:left="5760" w:hanging="360"/>
+      </w:pPr>
+      <w:rPr>
+        <w:rFonts w:ascii="Courier New" w:hAnsi="Courier New" w:cs="Courier New" w:hint="default"/>
+      </w:rPr>
+    </w:lvl>
+    <w:lvl w:ilvl="8" w:tplc="04090005" w:tentative="1">
+      <w:start w:val="1"/>
+      <w:numFmt w:val="bullet"/>
+      <w:lvlText w:val=""/>
+      <w:lvlJc w:val="left"/>
+      <w:pPr>
+        <w:ind w:left="6480" w:hanging="360"/>
+      </w:pPr>
+      <w:rPr>
+        <w:rFonts w:ascii="Wingdings" w:hAnsi="Wingdings" w:hint="default"/>
+      </w:rPr>
+    </w:lvl>
+  </w:abstractNum>
+  <w:abstractNum w:abstractNumId="13" w15:restartNumberingAfterBreak="0">
+    <w:nsid w:val="647D493F"/>
+    <w:multiLevelType w:val="hybridMultilevel"/>
+    <w:tmpl w:val="6032C580"/>
+    <w:lvl w:ilvl="0" w:tplc="04090001">
+      <w:start w:val="1"/>
+      <w:numFmt w:val="bullet"/>
+      <w:lvlText w:val=""/>
+      <w:lvlJc w:val="left"/>
+      <w:pPr>
+        <w:ind w:left="720" w:hanging="360"/>
+      </w:pPr>
+      <w:rPr>
+        <w:rFonts w:ascii="Symbol" w:hAnsi="Symbol" w:hint="default"/>
+      </w:rPr>
+    </w:lvl>
+    <w:lvl w:ilvl="1" w:tplc="04090003" w:tentative="1">
+      <w:start w:val="1"/>
+      <w:numFmt w:val="bullet"/>
+      <w:lvlText w:val="o"/>
+      <w:lvlJc w:val="left"/>
+      <w:pPr>
+        <w:ind w:left="1440" w:hanging="360"/>
+      </w:pPr>
+      <w:rPr>
+        <w:rFonts w:ascii="Courier New" w:hAnsi="Courier New" w:cs="Courier New" w:hint="default"/>
+      </w:rPr>
+    </w:lvl>
+    <w:lvl w:ilvl="2" w:tplc="04090005" w:tentative="1">
+      <w:start w:val="1"/>
+      <w:numFmt w:val="bullet"/>
+      <w:lvlText w:val=""/>
+      <w:lvlJc w:val="left"/>
+      <w:pPr>
+        <w:ind w:left="2160" w:hanging="360"/>
+      </w:pPr>
+      <w:rPr>
+        <w:rFonts w:ascii="Wingdings" w:hAnsi="Wingdings" w:hint="default"/>
+      </w:rPr>
+    </w:lvl>
+    <w:lvl w:ilvl="3" w:tplc="04090001" w:tentative="1">
+      <w:start w:val="1"/>
+      <w:numFmt w:val="bullet"/>
+      <w:lvlText w:val=""/>
+      <w:lvlJc w:val="left"/>
+      <w:pPr>
+        <w:ind w:left="2880" w:hanging="360"/>
+      </w:pPr>
+      <w:rPr>
+        <w:rFonts w:ascii="Symbol" w:hAnsi="Symbol" w:hint="default"/>
+      </w:rPr>
+    </w:lvl>
+    <w:lvl w:ilvl="4" w:tplc="04090003" w:tentative="1">
+      <w:start w:val="1"/>
+      <w:numFmt w:val="bullet"/>
+      <w:lvlText w:val="o"/>
+      <w:lvlJc w:val="left"/>
+      <w:pPr>
+        <w:ind w:left="3600" w:hanging="360"/>
+      </w:pPr>
+      <w:rPr>
+        <w:rFonts w:ascii="Courier New" w:hAnsi="Courier New" w:cs="Courier New" w:hint="default"/>
+      </w:rPr>
+    </w:lvl>
+    <w:lvl w:ilvl="5" w:tplc="04090005" w:tentative="1">
+      <w:start w:val="1"/>
+      <w:numFmt w:val="bullet"/>
+      <w:lvlText w:val=""/>
+      <w:lvlJc w:val="left"/>
+      <w:pPr>
+        <w:ind w:left="4320" w:hanging="360"/>
+      </w:pPr>
+      <w:rPr>
+        <w:rFonts w:ascii="Wingdings" w:hAnsi="Wingdings" w:hint="default"/>
+      </w:rPr>
+    </w:lvl>
+    <w:lvl w:ilvl="6" w:tplc="04090001" w:tentative="1">
+      <w:start w:val="1"/>
+      <w:numFmt w:val="bullet"/>
+      <w:lvlText w:val=""/>
+      <w:lvlJc w:val="left"/>
+      <w:pPr>
+        <w:ind w:left="5040" w:hanging="360"/>
+      </w:pPr>
+      <w:rPr>
+        <w:rFonts w:ascii="Symbol" w:hAnsi="Symbol" w:hint="default"/>
+      </w:rPr>
+    </w:lvl>
+    <w:lvl w:ilvl="7" w:tplc="04090003" w:tentative="1">
+      <w:start w:val="1"/>
+      <w:numFmt w:val="bullet"/>
+      <w:lvlText w:val="o"/>
+      <w:lvlJc w:val="left"/>
+      <w:pPr>
+        <w:ind w:left="5760" w:hanging="360"/>
+      </w:pPr>
+      <w:rPr>
+        <w:rFonts w:ascii="Courier New" w:hAnsi="Courier New" w:cs="Courier New" w:hint="default"/>
+      </w:rPr>
+    </w:lvl>
+    <w:lvl w:ilvl="8" w:tplc="04090005" w:tentative="1">
+      <w:start w:val="1"/>
+      <w:numFmt w:val="bullet"/>
+      <w:lvlText w:val=""/>
+      <w:lvlJc w:val="left"/>
+      <w:pPr>
+        <w:ind w:left="6480" w:hanging="360"/>
+      </w:pPr>
+      <w:rPr>
+        <w:rFonts w:ascii="Wingdings" w:hAnsi="Wingdings" w:hint="default"/>
+      </w:rPr>
+    </w:lvl>
+  </w:abstractNum>
+  <w:abstractNum w:abstractNumId="14" w15:restartNumberingAfterBreak="0">
     <w:nsid w:val="6B7371A4"/>
     <w:multiLevelType w:val="multilevel"/>
     <w:tmpl w:val="D8944DAE"/>
@@ -3329,7 +4083,7 @@
       </w:rPr>
     </w:lvl>
   </w:abstractNum>
-  <w:abstractNum w:abstractNumId="7" w15:restartNumberingAfterBreak="0">
+  <w:abstractNum w:abstractNumId="15" w15:restartNumberingAfterBreak="0">
     <w:nsid w:val="7A891E6D"/>
     <w:multiLevelType w:val="multilevel"/>
     <w:tmpl w:val="EDF8F290"/>
@@ -3479,28 +4233,52 @@
     </w:lvl>
   </w:abstractNum>
   <w:num w:numId="1" w16cid:durableId="391348016">
+    <w:abstractNumId w:val="15"/>
+  </w:num>
+  <w:num w:numId="2" w16cid:durableId="1853110730">
+    <w:abstractNumId w:val="5"/>
+  </w:num>
+  <w:num w:numId="3" w16cid:durableId="83770927">
+    <w:abstractNumId w:val="9"/>
+  </w:num>
+  <w:num w:numId="4" w16cid:durableId="2053772923">
+    <w:abstractNumId w:val="11"/>
+  </w:num>
+  <w:num w:numId="5" w16cid:durableId="1877505297">
+    <w:abstractNumId w:val="4"/>
+  </w:num>
+  <w:num w:numId="6" w16cid:durableId="768089209">
+    <w:abstractNumId w:val="14"/>
+  </w:num>
+  <w:num w:numId="7" w16cid:durableId="957687781">
+    <w:abstractNumId w:val="3"/>
+  </w:num>
+  <w:num w:numId="8" w16cid:durableId="1322470069">
+    <w:abstractNumId w:val="6"/>
+  </w:num>
+  <w:num w:numId="9" w16cid:durableId="396630060">
+    <w:abstractNumId w:val="0"/>
+  </w:num>
+  <w:num w:numId="10" w16cid:durableId="929201021">
     <w:abstractNumId w:val="7"/>
   </w:num>
-  <w:num w:numId="2" w16cid:durableId="1853110730">
+  <w:num w:numId="11" w16cid:durableId="109594026">
+    <w:abstractNumId w:val="10"/>
+  </w:num>
+  <w:num w:numId="12" w16cid:durableId="934019195">
+    <w:abstractNumId w:val="1"/>
+  </w:num>
+  <w:num w:numId="13" w16cid:durableId="1150247777">
+    <w:abstractNumId w:val="12"/>
+  </w:num>
+  <w:num w:numId="14" w16cid:durableId="1817452512">
     <w:abstractNumId w:val="2"/>
   </w:num>
-  <w:num w:numId="3" w16cid:durableId="83770927">
-    <w:abstractNumId w:val="4"/>
+  <w:num w:numId="15" w16cid:durableId="550845242">
+    <w:abstractNumId w:val="13"/>
   </w:num>
-  <w:num w:numId="4" w16cid:durableId="2053772923">
-    <w:abstractNumId w:val="5"/>
-  </w:num>
-  <w:num w:numId="5" w16cid:durableId="1877505297">
-    <w:abstractNumId w:val="1"/>
-  </w:num>
-  <w:num w:numId="6" w16cid:durableId="768089209">
-    <w:abstractNumId w:val="6"/>
-  </w:num>
-  <w:num w:numId="7" w16cid:durableId="957687781">
-    <w:abstractNumId w:val="0"/>
-  </w:num>
-  <w:num w:numId="8" w16cid:durableId="1322470069">
-    <w:abstractNumId w:val="3"/>
+  <w:num w:numId="16" w16cid:durableId="1263496583">
+    <w:abstractNumId w:val="8"/>
   </w:num>
 </w:numbering>
 </file>

</xml_diff>